<commit_message>
update 8_TOI lab and report; Add MS_2 lab and report
</commit_message>
<xml_diff>
--- a/TOI/TOI_8/Migachev_8.1_1.docx
+++ b/TOI/TOI_8/Migachev_8.1_1.docx
@@ -1,6 +1,6 @@
 
 <file path=word/document.xml><?xml version="1.0" encoding="utf-8"?>
-<w:document xmlns:wpc="http://schemas.microsoft.com/office/word/2010/wordprocessingCanvas" xmlns:cx="http://schemas.microsoft.com/office/drawing/2014/chartex" xmlns:cx1="http://schemas.microsoft.com/office/drawing/2015/9/8/chartex" xmlns:cx2="http://schemas.microsoft.com/office/drawing/2015/10/21/chartex" xmlns:cx3="http://schemas.microsoft.com/office/drawing/2016/5/9/chartex" xmlns:cx4="http://schemas.microsoft.com/office/drawing/2016/5/10/chartex" xmlns:cx5="http://schemas.microsoft.com/office/drawing/2016/5/11/chartex" xmlns:cx6="http://schemas.microsoft.com/office/drawing/2016/5/12/chartex" xmlns:cx7="http://schemas.microsoft.com/office/drawing/2016/5/13/chartex" xmlns:cx8="http://schemas.microsoft.com/office/drawing/2016/5/14/chartex" xmlns:mc="http://schemas.openxmlformats.org/markup-compatibility/2006" xmlns:aink="http://schemas.microsoft.com/office/drawing/2016/ink" xmlns:am3d="http://schemas.microsoft.com/office/drawing/2017/model3d" xmlns:o="urn:schemas-microsoft-com:office:office" xmlns:r="http://schemas.openxmlformats.org/officeDocument/2006/relationships" xmlns:m="http://schemas.openxmlformats.org/officeDocument/2006/math" xmlns:v="urn:schemas-microsoft-com:vml" xmlns:wp14="http://schemas.microsoft.com/office/word/2010/wordprocessingDrawing" xmlns:wp="http://schemas.openxmlformats.org/drawingml/2006/wordprocessingDrawing" xmlns:w10="urn:schemas-microsoft-com:office:word" xmlns:w="http://schemas.openxmlformats.org/wordprocessingml/2006/main" xmlns:w14="http://schemas.microsoft.com/office/word/2010/wordml" xmlns:w15="http://schemas.microsoft.com/office/word/2012/wordml" xmlns:w16cex="http://schemas.microsoft.com/office/word/2018/wordml/cex" xmlns:w16cid="http://schemas.microsoft.com/office/word/2016/wordml/cid" xmlns:w16="http://schemas.microsoft.com/office/word/2018/wordml" xmlns:w16sdtdh="http://schemas.microsoft.com/office/word/2020/wordml/sdtdatahash" xmlns:w16se="http://schemas.microsoft.com/office/word/2015/wordml/symex" xmlns:wpg="http://schemas.microsoft.com/office/word/2010/wordprocessingGroup" xmlns:wpi="http://schemas.microsoft.com/office/word/2010/wordprocessingInk" xmlns:wne="http://schemas.microsoft.com/office/word/2006/wordml" xmlns:wps="http://schemas.microsoft.com/office/word/2010/wordprocessingShape" mc:Ignorable="w14 w15 w16se w16cid w16 w16cex w16sdtdh wp14">
+<w:document xmlns:wpc="http://schemas.microsoft.com/office/word/2010/wordprocessingCanvas" xmlns:cx="http://schemas.microsoft.com/office/drawing/2014/chartex" xmlns:cx1="http://schemas.microsoft.com/office/drawing/2015/9/8/chartex" xmlns:cx2="http://schemas.microsoft.com/office/drawing/2015/10/21/chartex" xmlns:cx3="http://schemas.microsoft.com/office/drawing/2016/5/9/chartex" xmlns:cx4="http://schemas.microsoft.com/office/drawing/2016/5/10/chartex" xmlns:cx5="http://schemas.microsoft.com/office/drawing/2016/5/11/chartex" xmlns:cx6="http://schemas.microsoft.com/office/drawing/2016/5/12/chartex" xmlns:cx7="http://schemas.microsoft.com/office/drawing/2016/5/13/chartex" xmlns:cx8="http://schemas.microsoft.com/office/drawing/2016/5/14/chartex" xmlns:mc="http://schemas.openxmlformats.org/markup-compatibility/2006" xmlns:aink="http://schemas.microsoft.com/office/drawing/2016/ink" xmlns:am3d="http://schemas.microsoft.com/office/drawing/2017/model3d" xmlns:o="urn:schemas-microsoft-com:office:office" xmlns:oel="http://schemas.microsoft.com/office/2019/extlst" xmlns:r="http://schemas.openxmlformats.org/officeDocument/2006/relationships" xmlns:m="http://schemas.openxmlformats.org/officeDocument/2006/math" xmlns:v="urn:schemas-microsoft-com:vml" xmlns:wp14="http://schemas.microsoft.com/office/word/2010/wordprocessingDrawing" xmlns:wp="http://schemas.openxmlformats.org/drawingml/2006/wordprocessingDrawing" xmlns:w10="urn:schemas-microsoft-com:office:word" xmlns:w="http://schemas.openxmlformats.org/wordprocessingml/2006/main" xmlns:w14="http://schemas.microsoft.com/office/word/2010/wordml" xmlns:w15="http://schemas.microsoft.com/office/word/2012/wordml" xmlns:w16cex="http://schemas.microsoft.com/office/word/2018/wordml/cex" xmlns:w16cid="http://schemas.microsoft.com/office/word/2016/wordml/cid" xmlns:w16="http://schemas.microsoft.com/office/word/2018/wordml" xmlns:w16du="http://schemas.microsoft.com/office/word/2023/wordml/word16du" xmlns:w16sdtdh="http://schemas.microsoft.com/office/word/2020/wordml/sdtdatahash" xmlns:w16sdtfl="http://schemas.microsoft.com/office/word/2024/wordml/sdtformatlock" xmlns:w16se="http://schemas.microsoft.com/office/word/2015/wordml/symex" xmlns:wpg="http://schemas.microsoft.com/office/word/2010/wordprocessingGroup" xmlns:wpi="http://schemas.microsoft.com/office/word/2010/wordprocessingInk" xmlns:wne="http://schemas.microsoft.com/office/word/2006/wordml" xmlns:wps="http://schemas.microsoft.com/office/word/2010/wordprocessingShape" mc:Ignorable="w14 w15 w16se w16cid w16 w16cex w16sdtdh w16sdtfl w16du wp14">
   <w:background w:color="FFFFFF"/>
   <w:body>
     <w:p>
@@ -453,6 +453,7 @@
         </w:rPr>
         <w:t xml:space="preserve"> </w:t>
       </w:r>
+      <w:proofErr w:type="spellStart"/>
       <w:r>
         <w:rPr>
           <w:rFonts w:ascii="Courier New" w:hAnsi="Courier New" w:cs="Courier New"/>
@@ -460,7 +461,17 @@
           <w:sz w:val="20"/>
           <w:szCs w:val="20"/>
         </w:rPr>
-        <w:t xml:space="preserve">as </w:t>
+        <w:t>as</w:t>
+      </w:r>
+      <w:proofErr w:type="spellEnd"/>
+      <w:r>
+        <w:rPr>
+          <w:rFonts w:ascii="Courier New" w:hAnsi="Courier New" w:cs="Courier New"/>
+          <w:color w:val="0033B3"/>
+          <w:sz w:val="20"/>
+          <w:szCs w:val="20"/>
+        </w:rPr>
+        <w:t xml:space="preserve"> </w:t>
       </w:r>
       <w:proofErr w:type="spellStart"/>
       <w:r>
@@ -522,6 +533,7 @@
         </w:rPr>
         <w:t xml:space="preserve"> </w:t>
       </w:r>
+      <w:proofErr w:type="spellStart"/>
       <w:r>
         <w:rPr>
           <w:rFonts w:ascii="Courier New" w:hAnsi="Courier New" w:cs="Courier New"/>
@@ -529,7 +541,17 @@
           <w:sz w:val="20"/>
           <w:szCs w:val="20"/>
         </w:rPr>
-        <w:t xml:space="preserve">as </w:t>
+        <w:t>as</w:t>
+      </w:r>
+      <w:proofErr w:type="spellEnd"/>
+      <w:r>
+        <w:rPr>
+          <w:rFonts w:ascii="Courier New" w:hAnsi="Courier New" w:cs="Courier New"/>
+          <w:color w:val="0033B3"/>
+          <w:sz w:val="20"/>
+          <w:szCs w:val="20"/>
+        </w:rPr>
+        <w:t xml:space="preserve"> </w:t>
       </w:r>
       <w:proofErr w:type="spellStart"/>
       <w:r>
@@ -591,6 +613,7 @@
         </w:rPr>
         <w:t xml:space="preserve"> </w:t>
       </w:r>
+      <w:proofErr w:type="spellStart"/>
       <w:r>
         <w:rPr>
           <w:rFonts w:ascii="Courier New" w:hAnsi="Courier New" w:cs="Courier New"/>
@@ -598,7 +621,17 @@
           <w:sz w:val="20"/>
           <w:szCs w:val="20"/>
         </w:rPr>
-        <w:t xml:space="preserve">as </w:t>
+        <w:t>as</w:t>
+      </w:r>
+      <w:proofErr w:type="spellEnd"/>
+      <w:r>
+        <w:rPr>
+          <w:rFonts w:ascii="Courier New" w:hAnsi="Courier New" w:cs="Courier New"/>
+          <w:color w:val="0033B3"/>
+          <w:sz w:val="20"/>
+          <w:szCs w:val="20"/>
+        </w:rPr>
+        <w:t xml:space="preserve"> </w:t>
       </w:r>
       <w:proofErr w:type="spellStart"/>
       <w:r>
@@ -6904,7 +6937,6 @@
         </w:rPr>
         <w:t xml:space="preserve"> </w:t>
       </w:r>
-      <w:proofErr w:type="spellStart"/>
       <w:r>
         <w:rPr>
           <w:rFonts w:ascii="Courier New" w:hAnsi="Courier New" w:cs="Courier New"/>
@@ -6916,7 +6948,6 @@
         </w:rPr>
         <w:t>фишера</w:t>
       </w:r>
-      <w:proofErr w:type="spellEnd"/>
       <w:r>
         <w:rPr>
           <w:rFonts w:ascii="Courier New" w:hAnsi="Courier New" w:cs="Courier New"/>
@@ -11230,9 +11261,9 @@
           <w:noProof/>
         </w:rPr>
         <w:drawing>
-          <wp:inline distT="0" distB="0" distL="0" distR="0" wp14:anchorId="481E5B3A" wp14:editId="2907AAE0">
+          <wp:inline distT="0" distB="0" distL="0" distR="0" wp14:anchorId="481E5B3A" wp14:editId="2FBDE8AE">
             <wp:extent cx="5940425" cy="3375660"/>
-            <wp:effectExtent l="190500" t="190500" r="174625" b="186690"/>
+            <wp:effectExtent l="152400" t="152400" r="346075" b="345440"/>
             <wp:docPr id="16" name="Рисунок 16"/>
             <wp:cNvGraphicFramePr>
               <a:graphicFrameLocks xmlns:a="http://schemas.openxmlformats.org/drawingml/2006/main" noChangeAspect="1"/>
@@ -11258,35 +11289,16 @@
                     <a:prstGeom prst="rect">
                       <a:avLst/>
                     </a:prstGeom>
-                    <a:solidFill>
-                      <a:srgbClr val="FFFFFF">
-                        <a:shade val="85000"/>
-                      </a:srgbClr>
-                    </a:solidFill>
-                    <a:ln w="190500" cap="rnd">
-                      <a:solidFill>
-                        <a:srgbClr val="FFFFFF"/>
-                      </a:solidFill>
+                    <a:ln>
+                      <a:noFill/>
                     </a:ln>
                     <a:effectLst>
-                      <a:outerShdw blurRad="50000" algn="tl" rotWithShape="0">
-                        <a:srgbClr val="000000">
-                          <a:alpha val="41000"/>
+                      <a:outerShdw blurRad="292100" dist="139700" dir="2700000" algn="tl" rotWithShape="0">
+                        <a:srgbClr val="333333">
+                          <a:alpha val="65000"/>
                         </a:srgbClr>
                       </a:outerShdw>
                     </a:effectLst>
-                    <a:scene3d>
-                      <a:camera prst="orthographicFront"/>
-                      <a:lightRig rig="twoPt" dir="t">
-                        <a:rot lat="0" lon="0" rev="7800000"/>
-                      </a:lightRig>
-                    </a:scene3d>
-                    <a:sp3d contourW="6350">
-                      <a:bevelT w="50800" h="16510"/>
-                      <a:contourClr>
-                        <a:srgbClr val="C0C0C0"/>
-                      </a:contourClr>
-                    </a:sp3d>
                   </pic:spPr>
                 </pic:pic>
               </a:graphicData>
@@ -11381,8 +11393,8 @@
         <w:spacing w:line="276" w:lineRule="auto"/>
         <w:rPr>
           <w:rFonts w:ascii="Arial" w:eastAsia="Arial" w:hAnsi="Arial" w:cs="Arial"/>
-          <w:sz w:val="24"/>
-          <w:szCs w:val="24"/>
+          <w:sz w:val="28"/>
+          <w:szCs w:val="28"/>
         </w:rPr>
       </w:pPr>
       <w:r>
@@ -11391,7 +11403,7 @@
           <w:sz w:val="24"/>
           <w:szCs w:val="24"/>
         </w:rPr>
-        <w:t>У</w:t>
+        <w:t>Когда данных становится больше, модель обучается точнее.</w:t>
       </w:r>
       <w:r>
         <w:rPr>
@@ -11399,7 +11411,24 @@
           <w:sz w:val="24"/>
           <w:szCs w:val="24"/>
         </w:rPr>
-        <w:t>величение объёма обучающей выборки приводит к тому, что оценки коэффициентов регрессии становятся более точными, остаточная ошибка уменьшается, а коэффициент детерминации R² возрастает. Это делает модель более устойчивой, а её значимость по критерию Фишера — выше. Чем больше данных, тем надёжнее проверка гипотезы о значимости регрессии и тем меньше влияние случайного шума.</w:t>
+        <w:br/>
+        <w:t>Коэффициенты регрессии меньше “прыгают”, ошибка уменьшается, а R² растёт.</w:t>
+      </w:r>
+      <w:r>
+        <w:rPr>
+          <w:rFonts w:ascii="Arial" w:hAnsi="Arial" w:cs="Arial"/>
+          <w:sz w:val="24"/>
+          <w:szCs w:val="24"/>
+        </w:rPr>
+        <w:t xml:space="preserve"> </w:t>
+      </w:r>
+      <w:r>
+        <w:rPr>
+          <w:rFonts w:ascii="Arial" w:hAnsi="Arial" w:cs="Arial"/>
+          <w:sz w:val="24"/>
+          <w:szCs w:val="24"/>
+        </w:rPr>
+        <w:t>То есть большая выборка делает модель более надёжной, а её проверка по критерию Фишера показывает, что модель действительно значимая.</w:t>
       </w:r>
     </w:p>
     <w:p>
@@ -11419,8 +11448,8 @@
         <w:spacing w:line="276" w:lineRule="auto"/>
         <w:rPr>
           <w:rFonts w:ascii="Arial" w:eastAsia="Arial" w:hAnsi="Arial" w:cs="Arial"/>
-          <w:sz w:val="24"/>
-          <w:szCs w:val="24"/>
+          <w:sz w:val="32"/>
+          <w:szCs w:val="32"/>
         </w:rPr>
       </w:pPr>
       <w:r>
@@ -11429,7 +11458,7 @@
           <w:sz w:val="24"/>
           <w:szCs w:val="24"/>
         </w:rPr>
-        <w:t>П</w:t>
+        <w:t>Если регуляризация слишком маленькая — модель начинает подстраиваться под шум и переобучается.</w:t>
       </w:r>
       <w:r>
         <w:rPr>
@@ -11437,25 +11466,17 @@
           <w:sz w:val="24"/>
           <w:szCs w:val="24"/>
         </w:rPr>
-        <w:t xml:space="preserve">араметр регуляризации влияет на баланс между точностью и устойчивостью модели. При слишком малом значении модель может переобучаться и подстраиваться под шум, порождая большие и нестабильные коэффициенты. При слишком большом значении регуляризации модель чрезмерно сглаживается и </w:t>
-      </w:r>
-      <w:proofErr w:type="spellStart"/>
+        <w:br/>
+        <w:t>Если регуляризация слишком большая — модель становится слишком простой и недообучается.</w:t>
+      </w:r>
       <w:r>
         <w:rPr>
           <w:rFonts w:ascii="Arial" w:hAnsi="Arial" w:cs="Arial"/>
           <w:sz w:val="24"/>
           <w:szCs w:val="24"/>
         </w:rPr>
-        <w:t>недообучается</w:t>
-      </w:r>
-      <w:proofErr w:type="spellEnd"/>
-      <w:r>
-        <w:rPr>
-          <w:rFonts w:ascii="Arial" w:hAnsi="Arial" w:cs="Arial"/>
-          <w:sz w:val="24"/>
-          <w:szCs w:val="24"/>
-        </w:rPr>
-        <w:t>, теряя способность точно описывать зависимость. Правильный выбор параметра позволяет повысить устойчивость решения и избежать переобучения.</w:t>
+        <w:br/>
+        <w:t>Нужно искать баланс: чтобы модель не была ни слишком сложной, ни слишком простой.</w:t>
       </w:r>
     </w:p>
     <w:p>
@@ -11475,8 +11496,8 @@
         <w:spacing w:line="276" w:lineRule="auto"/>
         <w:rPr>
           <w:rFonts w:ascii="Arial" w:eastAsia="Arial" w:hAnsi="Arial" w:cs="Arial"/>
-          <w:sz w:val="28"/>
-          <w:szCs w:val="28"/>
+          <w:sz w:val="32"/>
+          <w:szCs w:val="32"/>
         </w:rPr>
       </w:pPr>
       <w:r>
@@ -11485,7 +11506,39 @@
           <w:sz w:val="24"/>
           <w:szCs w:val="24"/>
         </w:rPr>
-        <w:t>Регуляризация требуется в ситуациях, когда модель сложная относительно количества данных, когда признаки сильно коррелированы между собой, когда используется полином высокой степени или когда данные содержат значительный шум. В таких условиях обычный метод наименьших квадратов становится нестабильным, а регуляризация позволяет получить надёжные оценки коэффициентов и улучшить обобщающую способность модели.</w:t>
+        <w:t>Регуляризация нужна, когда модель слишком сложная, данных мало или в данных много шума.</w:t>
+      </w:r>
+      <w:r>
+        <w:rPr>
+          <w:rFonts w:ascii="Arial" w:hAnsi="Arial" w:cs="Arial"/>
+          <w:sz w:val="24"/>
+          <w:szCs w:val="24"/>
+        </w:rPr>
+        <w:t xml:space="preserve"> </w:t>
+      </w:r>
+      <w:r>
+        <w:rPr>
+          <w:rFonts w:ascii="Arial" w:hAnsi="Arial" w:cs="Arial"/>
+          <w:sz w:val="24"/>
+          <w:szCs w:val="24"/>
+        </w:rPr>
+        <w:t>Также она нужна, когда признаки между собой сильно связаны.</w:t>
+      </w:r>
+      <w:r>
+        <w:rPr>
+          <w:rFonts w:ascii="Arial" w:hAnsi="Arial" w:cs="Arial"/>
+          <w:sz w:val="24"/>
+          <w:szCs w:val="24"/>
+        </w:rPr>
+        <w:t xml:space="preserve"> </w:t>
+      </w:r>
+      <w:r>
+        <w:rPr>
+          <w:rFonts w:ascii="Arial" w:hAnsi="Arial" w:cs="Arial"/>
+          <w:sz w:val="24"/>
+          <w:szCs w:val="24"/>
+        </w:rPr>
+        <w:t>В таких случаях обычная регрессия начинает “разлетаться”, а регуляризация стабилизирует решение.</w:t>
       </w:r>
     </w:p>
     <w:p>
@@ -11522,27 +11575,89 @@
         <w:rPr>
           <w:rFonts w:ascii="Arial" w:hAnsi="Arial" w:cs="Arial"/>
         </w:rPr>
-        <w:t xml:space="preserve">В </w:t>
+        <w:t xml:space="preserve">В этой работе </w:t>
       </w:r>
       <w:r>
         <w:rPr>
           <w:rFonts w:ascii="Arial" w:hAnsi="Arial" w:cs="Arial"/>
         </w:rPr>
-        <w:t xml:space="preserve">ходе работы была исследована полиномиальная модель регрессии пятой степени и построена её оценка методом наименьших квадратов при различных объёмах обучающей выборки. Полученные результаты показали, что при увеличении числа наблюдений качество аппроксимации возрастает, коэффициент детерминации стремится к единице, а модель становится более значимой по критерию Фишера. Графики продемонстрировали практически полное совпадение истинной функции и оценённой регрессии благодаря точному совпадению структуры модели и использованию </w:t>
+        <w:t>было</w:t>
+      </w:r>
+      <w:r>
+        <w:rPr>
+          <w:rFonts w:ascii="Arial" w:hAnsi="Arial" w:cs="Arial"/>
+        </w:rPr>
+        <w:t xml:space="preserve"> исследова</w:t>
+      </w:r>
+      <w:r>
+        <w:rPr>
+          <w:rFonts w:ascii="Arial" w:hAnsi="Arial" w:cs="Arial"/>
+        </w:rPr>
+        <w:t>но</w:t>
+      </w:r>
+      <w:r>
+        <w:rPr>
+          <w:rFonts w:ascii="Arial" w:hAnsi="Arial" w:cs="Arial"/>
+        </w:rPr>
+        <w:t xml:space="preserve">, как работает полиномиальная регрессия пятой степени и как она восстанавливает заданную функцию по шумным данным. </w:t>
+      </w:r>
+      <w:r>
+        <w:rPr>
+          <w:rFonts w:ascii="Arial" w:hAnsi="Arial" w:cs="Arial"/>
+        </w:rPr>
+        <w:t>Была</w:t>
+      </w:r>
+      <w:r>
+        <w:rPr>
+          <w:rFonts w:ascii="Arial" w:hAnsi="Arial" w:cs="Arial"/>
+        </w:rPr>
+        <w:t xml:space="preserve"> постро</w:t>
+      </w:r>
+      <w:r>
+        <w:rPr>
+          <w:rFonts w:ascii="Arial" w:hAnsi="Arial" w:cs="Arial"/>
+        </w:rPr>
+        <w:t>ена</w:t>
+      </w:r>
+      <w:r>
+        <w:rPr>
+          <w:rFonts w:ascii="Arial" w:hAnsi="Arial" w:cs="Arial"/>
+        </w:rPr>
+        <w:t xml:space="preserve"> модель методом наименьших квадратов для разных объёмов </w:t>
+      </w:r>
+      <w:proofErr w:type="gramStart"/>
+      <w:r>
+        <w:rPr>
+          <w:rFonts w:ascii="Arial" w:hAnsi="Arial" w:cs="Arial"/>
+        </w:rPr>
+        <w:t>выборки</w:t>
+      </w:r>
+      <w:proofErr w:type="gramEnd"/>
+      <w:r>
+        <w:rPr>
+          <w:rFonts w:ascii="Arial" w:hAnsi="Arial" w:cs="Arial"/>
+        </w:rPr>
+        <w:t xml:space="preserve"> и </w:t>
+      </w:r>
+      <w:r>
+        <w:rPr>
+          <w:rFonts w:ascii="Arial" w:hAnsi="Arial" w:cs="Arial"/>
+        </w:rPr>
+        <w:t xml:space="preserve">мы </w:t>
       </w:r>
       <w:proofErr w:type="spellStart"/>
       <w:r>
         <w:rPr>
           <w:rFonts w:ascii="Arial" w:hAnsi="Arial" w:cs="Arial"/>
         </w:rPr>
-        <w:t>низкодисперсного</w:t>
+        <w:t>видимм</w:t>
       </w:r>
       <w:proofErr w:type="spellEnd"/>
       <w:r>
         <w:rPr>
           <w:rFonts w:ascii="Arial" w:hAnsi="Arial" w:cs="Arial"/>
         </w:rPr>
-        <w:t xml:space="preserve"> шума. Также были вычислены дисперсии ошибок, подтверждающие высокую точность оценивания. В целом задача показала корректность работы метода МНК и его зависимость от объёма обучающих данных.</w:t>
+        <w:t>, что чем больше данных, тем точнее модель и тем меньше ошибки. Коэффициент R² почти равен единице, а критерий Фишера показывает, что модель значимая. На графиках видно, что регрессия практически совпадает с истинной функцией, потому что модель выбрана правильно и шум маленький. Таким образом, работа показала, что метод МНК хорошо восстанавливает функцию и становится точнее при увеличении количества данных.</w:t>
       </w:r>
     </w:p>
     <w:sectPr>
@@ -11562,7 +11677,7 @@
 </file>
 
 <file path=word/endnotes.xml><?xml version="1.0" encoding="utf-8"?>
-<w:endnotes xmlns:wpc="http://schemas.microsoft.com/office/word/2010/wordprocessingCanvas" xmlns:cx="http://schemas.microsoft.com/office/drawing/2014/chartex" xmlns:cx1="http://schemas.microsoft.com/office/drawing/2015/9/8/chartex" xmlns:cx2="http://schemas.microsoft.com/office/drawing/2015/10/21/chartex" xmlns:cx3="http://schemas.microsoft.com/office/drawing/2016/5/9/chartex" xmlns:cx4="http://schemas.microsoft.com/office/drawing/2016/5/10/chartex" xmlns:cx5="http://schemas.microsoft.com/office/drawing/2016/5/11/chartex" xmlns:cx6="http://schemas.microsoft.com/office/drawing/2016/5/12/chartex" xmlns:cx7="http://schemas.microsoft.com/office/drawing/2016/5/13/chartex" xmlns:cx8="http://schemas.microsoft.com/office/drawing/2016/5/14/chartex" xmlns:mc="http://schemas.openxmlformats.org/markup-compatibility/2006" xmlns:aink="http://schemas.microsoft.com/office/drawing/2016/ink" xmlns:am3d="http://schemas.microsoft.com/office/drawing/2017/model3d" xmlns:o="urn:schemas-microsoft-com:office:office" xmlns:r="http://schemas.openxmlformats.org/officeDocument/2006/relationships" xmlns:m="http://schemas.openxmlformats.org/officeDocument/2006/math" xmlns:v="urn:schemas-microsoft-com:vml" xmlns:wp14="http://schemas.microsoft.com/office/word/2010/wordprocessingDrawing" xmlns:wp="http://schemas.openxmlformats.org/drawingml/2006/wordprocessingDrawing" xmlns:w10="urn:schemas-microsoft-com:office:word" xmlns:w="http://schemas.openxmlformats.org/wordprocessingml/2006/main" xmlns:w14="http://schemas.microsoft.com/office/word/2010/wordml" xmlns:w15="http://schemas.microsoft.com/office/word/2012/wordml" xmlns:w16cex="http://schemas.microsoft.com/office/word/2018/wordml/cex" xmlns:w16cid="http://schemas.microsoft.com/office/word/2016/wordml/cid" xmlns:w16="http://schemas.microsoft.com/office/word/2018/wordml" xmlns:w16sdtdh="http://schemas.microsoft.com/office/word/2020/wordml/sdtdatahash" xmlns:w16se="http://schemas.microsoft.com/office/word/2015/wordml/symex" xmlns:wpg="http://schemas.microsoft.com/office/word/2010/wordprocessingGroup" xmlns:wpi="http://schemas.microsoft.com/office/word/2010/wordprocessingInk" xmlns:wne="http://schemas.microsoft.com/office/word/2006/wordml" xmlns:wps="http://schemas.microsoft.com/office/word/2010/wordprocessingShape" mc:Ignorable="w14 w15 w16se w16cid w16 w16cex w16sdtdh wp14">
+<w:endnotes xmlns:wpc="http://schemas.microsoft.com/office/word/2010/wordprocessingCanvas" xmlns:cx="http://schemas.microsoft.com/office/drawing/2014/chartex" xmlns:cx1="http://schemas.microsoft.com/office/drawing/2015/9/8/chartex" xmlns:cx2="http://schemas.microsoft.com/office/drawing/2015/10/21/chartex" xmlns:cx3="http://schemas.microsoft.com/office/drawing/2016/5/9/chartex" xmlns:cx4="http://schemas.microsoft.com/office/drawing/2016/5/10/chartex" xmlns:cx5="http://schemas.microsoft.com/office/drawing/2016/5/11/chartex" xmlns:cx6="http://schemas.microsoft.com/office/drawing/2016/5/12/chartex" xmlns:cx7="http://schemas.microsoft.com/office/drawing/2016/5/13/chartex" xmlns:cx8="http://schemas.microsoft.com/office/drawing/2016/5/14/chartex" xmlns:mc="http://schemas.openxmlformats.org/markup-compatibility/2006" xmlns:aink="http://schemas.microsoft.com/office/drawing/2016/ink" xmlns:am3d="http://schemas.microsoft.com/office/drawing/2017/model3d" xmlns:o="urn:schemas-microsoft-com:office:office" xmlns:oel="http://schemas.microsoft.com/office/2019/extlst" xmlns:r="http://schemas.openxmlformats.org/officeDocument/2006/relationships" xmlns:m="http://schemas.openxmlformats.org/officeDocument/2006/math" xmlns:v="urn:schemas-microsoft-com:vml" xmlns:wp14="http://schemas.microsoft.com/office/word/2010/wordprocessingDrawing" xmlns:wp="http://schemas.openxmlformats.org/drawingml/2006/wordprocessingDrawing" xmlns:w10="urn:schemas-microsoft-com:office:word" xmlns:w="http://schemas.openxmlformats.org/wordprocessingml/2006/main" xmlns:w14="http://schemas.microsoft.com/office/word/2010/wordml" xmlns:w15="http://schemas.microsoft.com/office/word/2012/wordml" xmlns:w16cex="http://schemas.microsoft.com/office/word/2018/wordml/cex" xmlns:w16cid="http://schemas.microsoft.com/office/word/2016/wordml/cid" xmlns:w16="http://schemas.microsoft.com/office/word/2018/wordml" xmlns:w16du="http://schemas.microsoft.com/office/word/2023/wordml/word16du" xmlns:w16sdtdh="http://schemas.microsoft.com/office/word/2020/wordml/sdtdatahash" xmlns:w16sdtfl="http://schemas.microsoft.com/office/word/2024/wordml/sdtformatlock" xmlns:w16se="http://schemas.microsoft.com/office/word/2015/wordml/symex" xmlns:wpg="http://schemas.microsoft.com/office/word/2010/wordprocessingGroup" xmlns:wpi="http://schemas.microsoft.com/office/word/2010/wordprocessingInk" xmlns:wne="http://schemas.microsoft.com/office/word/2006/wordml" xmlns:wps="http://schemas.microsoft.com/office/word/2010/wordprocessingShape" mc:Ignorable="w14 w15 w16se w16cid w16 w16cex w16sdtdh w16sdtfl w16du wp14">
   <w:endnote w:type="separator" w:id="-1">
     <w:p>
       <w:r>
@@ -11581,7 +11696,7 @@
 </file>
 
 <file path=word/footer1.xml><?xml version="1.0" encoding="utf-8"?>
-<w:ftr xmlns:wpc="http://schemas.microsoft.com/office/word/2010/wordprocessingCanvas" xmlns:cx="http://schemas.microsoft.com/office/drawing/2014/chartex" xmlns:cx1="http://schemas.microsoft.com/office/drawing/2015/9/8/chartex" xmlns:cx2="http://schemas.microsoft.com/office/drawing/2015/10/21/chartex" xmlns:cx3="http://schemas.microsoft.com/office/drawing/2016/5/9/chartex" xmlns:cx4="http://schemas.microsoft.com/office/drawing/2016/5/10/chartex" xmlns:cx5="http://schemas.microsoft.com/office/drawing/2016/5/11/chartex" xmlns:cx6="http://schemas.microsoft.com/office/drawing/2016/5/12/chartex" xmlns:cx7="http://schemas.microsoft.com/office/drawing/2016/5/13/chartex" xmlns:cx8="http://schemas.microsoft.com/office/drawing/2016/5/14/chartex" xmlns:mc="http://schemas.openxmlformats.org/markup-compatibility/2006" xmlns:aink="http://schemas.microsoft.com/office/drawing/2016/ink" xmlns:am3d="http://schemas.microsoft.com/office/drawing/2017/model3d" xmlns:o="urn:schemas-microsoft-com:office:office" xmlns:r="http://schemas.openxmlformats.org/officeDocument/2006/relationships" xmlns:m="http://schemas.openxmlformats.org/officeDocument/2006/math" xmlns:v="urn:schemas-microsoft-com:vml" xmlns:wp14="http://schemas.microsoft.com/office/word/2010/wordprocessingDrawing" xmlns:wp="http://schemas.openxmlformats.org/drawingml/2006/wordprocessingDrawing" xmlns:w10="urn:schemas-microsoft-com:office:word" xmlns:w="http://schemas.openxmlformats.org/wordprocessingml/2006/main" xmlns:w14="http://schemas.microsoft.com/office/word/2010/wordml" xmlns:w15="http://schemas.microsoft.com/office/word/2012/wordml" xmlns:w16cex="http://schemas.microsoft.com/office/word/2018/wordml/cex" xmlns:w16cid="http://schemas.microsoft.com/office/word/2016/wordml/cid" xmlns:w16="http://schemas.microsoft.com/office/word/2018/wordml" xmlns:w16sdtdh="http://schemas.microsoft.com/office/word/2020/wordml/sdtdatahash" xmlns:w16se="http://schemas.microsoft.com/office/word/2015/wordml/symex" xmlns:wpg="http://schemas.microsoft.com/office/word/2010/wordprocessingGroup" xmlns:wpi="http://schemas.microsoft.com/office/word/2010/wordprocessingInk" xmlns:wne="http://schemas.microsoft.com/office/word/2006/wordml" xmlns:wps="http://schemas.microsoft.com/office/word/2010/wordprocessingShape" mc:Ignorable="w14 w15 w16se w16cid w16 w16cex w16sdtdh wp14">
+<w:ftr xmlns:wpc="http://schemas.microsoft.com/office/word/2010/wordprocessingCanvas" xmlns:cx="http://schemas.microsoft.com/office/drawing/2014/chartex" xmlns:cx1="http://schemas.microsoft.com/office/drawing/2015/9/8/chartex" xmlns:cx2="http://schemas.microsoft.com/office/drawing/2015/10/21/chartex" xmlns:cx3="http://schemas.microsoft.com/office/drawing/2016/5/9/chartex" xmlns:cx4="http://schemas.microsoft.com/office/drawing/2016/5/10/chartex" xmlns:cx5="http://schemas.microsoft.com/office/drawing/2016/5/11/chartex" xmlns:cx6="http://schemas.microsoft.com/office/drawing/2016/5/12/chartex" xmlns:cx7="http://schemas.microsoft.com/office/drawing/2016/5/13/chartex" xmlns:cx8="http://schemas.microsoft.com/office/drawing/2016/5/14/chartex" xmlns:mc="http://schemas.openxmlformats.org/markup-compatibility/2006" xmlns:aink="http://schemas.microsoft.com/office/drawing/2016/ink" xmlns:am3d="http://schemas.microsoft.com/office/drawing/2017/model3d" xmlns:o="urn:schemas-microsoft-com:office:office" xmlns:oel="http://schemas.microsoft.com/office/2019/extlst" xmlns:r="http://schemas.openxmlformats.org/officeDocument/2006/relationships" xmlns:m="http://schemas.openxmlformats.org/officeDocument/2006/math" xmlns:v="urn:schemas-microsoft-com:vml" xmlns:wp14="http://schemas.microsoft.com/office/word/2010/wordprocessingDrawing" xmlns:wp="http://schemas.openxmlformats.org/drawingml/2006/wordprocessingDrawing" xmlns:w10="urn:schemas-microsoft-com:office:word" xmlns:w="http://schemas.openxmlformats.org/wordprocessingml/2006/main" xmlns:w14="http://schemas.microsoft.com/office/word/2010/wordml" xmlns:w15="http://schemas.microsoft.com/office/word/2012/wordml" xmlns:w16cex="http://schemas.microsoft.com/office/word/2018/wordml/cex" xmlns:w16cid="http://schemas.microsoft.com/office/word/2016/wordml/cid" xmlns:w16="http://schemas.microsoft.com/office/word/2018/wordml" xmlns:w16du="http://schemas.microsoft.com/office/word/2023/wordml/word16du" xmlns:w16sdtdh="http://schemas.microsoft.com/office/word/2020/wordml/sdtdatahash" xmlns:w16sdtfl="http://schemas.microsoft.com/office/word/2024/wordml/sdtformatlock" xmlns:w16se="http://schemas.microsoft.com/office/word/2015/wordml/symex" xmlns:wpg="http://schemas.microsoft.com/office/word/2010/wordprocessingGroup" xmlns:wpi="http://schemas.microsoft.com/office/word/2010/wordprocessingInk" xmlns:wne="http://schemas.microsoft.com/office/word/2006/wordml" xmlns:wps="http://schemas.microsoft.com/office/word/2010/wordprocessingShape" mc:Ignorable="w14 w15 w16se w16cid w16 w16cex w16sdtdh w16sdtfl w16du wp14">
   <w:p>
     <w:pPr>
       <w:pStyle w:val="a9"/>
@@ -11591,7 +11706,7 @@
 </file>
 
 <file path=word/footer2.xml><?xml version="1.0" encoding="utf-8"?>
-<w:ftr xmlns:wpc="http://schemas.microsoft.com/office/word/2010/wordprocessingCanvas" xmlns:cx="http://schemas.microsoft.com/office/drawing/2014/chartex" xmlns:cx1="http://schemas.microsoft.com/office/drawing/2015/9/8/chartex" xmlns:cx2="http://schemas.microsoft.com/office/drawing/2015/10/21/chartex" xmlns:cx3="http://schemas.microsoft.com/office/drawing/2016/5/9/chartex" xmlns:cx4="http://schemas.microsoft.com/office/drawing/2016/5/10/chartex" xmlns:cx5="http://schemas.microsoft.com/office/drawing/2016/5/11/chartex" xmlns:cx6="http://schemas.microsoft.com/office/drawing/2016/5/12/chartex" xmlns:cx7="http://schemas.microsoft.com/office/drawing/2016/5/13/chartex" xmlns:cx8="http://schemas.microsoft.com/office/drawing/2016/5/14/chartex" xmlns:mc="http://schemas.openxmlformats.org/markup-compatibility/2006" xmlns:aink="http://schemas.microsoft.com/office/drawing/2016/ink" xmlns:am3d="http://schemas.microsoft.com/office/drawing/2017/model3d" xmlns:o="urn:schemas-microsoft-com:office:office" xmlns:r="http://schemas.openxmlformats.org/officeDocument/2006/relationships" xmlns:m="http://schemas.openxmlformats.org/officeDocument/2006/math" xmlns:v="urn:schemas-microsoft-com:vml" xmlns:wp14="http://schemas.microsoft.com/office/word/2010/wordprocessingDrawing" xmlns:wp="http://schemas.openxmlformats.org/drawingml/2006/wordprocessingDrawing" xmlns:w10="urn:schemas-microsoft-com:office:word" xmlns:w="http://schemas.openxmlformats.org/wordprocessingml/2006/main" xmlns:w14="http://schemas.microsoft.com/office/word/2010/wordml" xmlns:w15="http://schemas.microsoft.com/office/word/2012/wordml" xmlns:w16cex="http://schemas.microsoft.com/office/word/2018/wordml/cex" xmlns:w16cid="http://schemas.microsoft.com/office/word/2016/wordml/cid" xmlns:w16="http://schemas.microsoft.com/office/word/2018/wordml" xmlns:w16sdtdh="http://schemas.microsoft.com/office/word/2020/wordml/sdtdatahash" xmlns:w16se="http://schemas.microsoft.com/office/word/2015/wordml/symex" xmlns:wpg="http://schemas.microsoft.com/office/word/2010/wordprocessingGroup" xmlns:wpi="http://schemas.microsoft.com/office/word/2010/wordprocessingInk" xmlns:wne="http://schemas.microsoft.com/office/word/2006/wordml" xmlns:wps="http://schemas.microsoft.com/office/word/2010/wordprocessingShape" mc:Ignorable="w14 w15 w16se w16cid w16 w16cex w16sdtdh wp14">
+<w:ftr xmlns:wpc="http://schemas.microsoft.com/office/word/2010/wordprocessingCanvas" xmlns:cx="http://schemas.microsoft.com/office/drawing/2014/chartex" xmlns:cx1="http://schemas.microsoft.com/office/drawing/2015/9/8/chartex" xmlns:cx2="http://schemas.microsoft.com/office/drawing/2015/10/21/chartex" xmlns:cx3="http://schemas.microsoft.com/office/drawing/2016/5/9/chartex" xmlns:cx4="http://schemas.microsoft.com/office/drawing/2016/5/10/chartex" xmlns:cx5="http://schemas.microsoft.com/office/drawing/2016/5/11/chartex" xmlns:cx6="http://schemas.microsoft.com/office/drawing/2016/5/12/chartex" xmlns:cx7="http://schemas.microsoft.com/office/drawing/2016/5/13/chartex" xmlns:cx8="http://schemas.microsoft.com/office/drawing/2016/5/14/chartex" xmlns:mc="http://schemas.openxmlformats.org/markup-compatibility/2006" xmlns:aink="http://schemas.microsoft.com/office/drawing/2016/ink" xmlns:am3d="http://schemas.microsoft.com/office/drawing/2017/model3d" xmlns:o="urn:schemas-microsoft-com:office:office" xmlns:oel="http://schemas.microsoft.com/office/2019/extlst" xmlns:r="http://schemas.openxmlformats.org/officeDocument/2006/relationships" xmlns:m="http://schemas.openxmlformats.org/officeDocument/2006/math" xmlns:v="urn:schemas-microsoft-com:vml" xmlns:wp14="http://schemas.microsoft.com/office/word/2010/wordprocessingDrawing" xmlns:wp="http://schemas.openxmlformats.org/drawingml/2006/wordprocessingDrawing" xmlns:w10="urn:schemas-microsoft-com:office:word" xmlns:w="http://schemas.openxmlformats.org/wordprocessingml/2006/main" xmlns:w14="http://schemas.microsoft.com/office/word/2010/wordml" xmlns:w15="http://schemas.microsoft.com/office/word/2012/wordml" xmlns:w16cex="http://schemas.microsoft.com/office/word/2018/wordml/cex" xmlns:w16cid="http://schemas.microsoft.com/office/word/2016/wordml/cid" xmlns:w16="http://schemas.microsoft.com/office/word/2018/wordml" xmlns:w16du="http://schemas.microsoft.com/office/word/2023/wordml/word16du" xmlns:w16sdtdh="http://schemas.microsoft.com/office/word/2020/wordml/sdtdatahash" xmlns:w16sdtfl="http://schemas.microsoft.com/office/word/2024/wordml/sdtformatlock" xmlns:w16se="http://schemas.microsoft.com/office/word/2015/wordml/symex" xmlns:wpg="http://schemas.microsoft.com/office/word/2010/wordprocessingGroup" xmlns:wpi="http://schemas.microsoft.com/office/word/2010/wordprocessingInk" xmlns:wne="http://schemas.microsoft.com/office/word/2006/wordml" xmlns:wps="http://schemas.microsoft.com/office/word/2010/wordprocessingShape" mc:Ignorable="w14 w15 w16se w16cid w16 w16cex w16sdtdh w16sdtfl w16du wp14">
   <w:p>
     <w:pPr>
       <w:pStyle w:val="a9"/>
@@ -11601,7 +11716,7 @@
 </file>
 
 <file path=word/footer3.xml><?xml version="1.0" encoding="utf-8"?>
-<w:ftr xmlns:wpc="http://schemas.microsoft.com/office/word/2010/wordprocessingCanvas" xmlns:cx="http://schemas.microsoft.com/office/drawing/2014/chartex" xmlns:cx1="http://schemas.microsoft.com/office/drawing/2015/9/8/chartex" xmlns:cx2="http://schemas.microsoft.com/office/drawing/2015/10/21/chartex" xmlns:cx3="http://schemas.microsoft.com/office/drawing/2016/5/9/chartex" xmlns:cx4="http://schemas.microsoft.com/office/drawing/2016/5/10/chartex" xmlns:cx5="http://schemas.microsoft.com/office/drawing/2016/5/11/chartex" xmlns:cx6="http://schemas.microsoft.com/office/drawing/2016/5/12/chartex" xmlns:cx7="http://schemas.microsoft.com/office/drawing/2016/5/13/chartex" xmlns:cx8="http://schemas.microsoft.com/office/drawing/2016/5/14/chartex" xmlns:mc="http://schemas.openxmlformats.org/markup-compatibility/2006" xmlns:aink="http://schemas.microsoft.com/office/drawing/2016/ink" xmlns:am3d="http://schemas.microsoft.com/office/drawing/2017/model3d" xmlns:o="urn:schemas-microsoft-com:office:office" xmlns:r="http://schemas.openxmlformats.org/officeDocument/2006/relationships" xmlns:m="http://schemas.openxmlformats.org/officeDocument/2006/math" xmlns:v="urn:schemas-microsoft-com:vml" xmlns:wp14="http://schemas.microsoft.com/office/word/2010/wordprocessingDrawing" xmlns:wp="http://schemas.openxmlformats.org/drawingml/2006/wordprocessingDrawing" xmlns:w10="urn:schemas-microsoft-com:office:word" xmlns:w="http://schemas.openxmlformats.org/wordprocessingml/2006/main" xmlns:w14="http://schemas.microsoft.com/office/word/2010/wordml" xmlns:w15="http://schemas.microsoft.com/office/word/2012/wordml" xmlns:w16cex="http://schemas.microsoft.com/office/word/2018/wordml/cex" xmlns:w16cid="http://schemas.microsoft.com/office/word/2016/wordml/cid" xmlns:w16="http://schemas.microsoft.com/office/word/2018/wordml" xmlns:w16sdtdh="http://schemas.microsoft.com/office/word/2020/wordml/sdtdatahash" xmlns:w16se="http://schemas.microsoft.com/office/word/2015/wordml/symex" xmlns:wpg="http://schemas.microsoft.com/office/word/2010/wordprocessingGroup" xmlns:wpi="http://schemas.microsoft.com/office/word/2010/wordprocessingInk" xmlns:wne="http://schemas.microsoft.com/office/word/2006/wordml" xmlns:wps="http://schemas.microsoft.com/office/word/2010/wordprocessingShape" mc:Ignorable="w14 w15 w16se w16cid w16 w16cex w16sdtdh wp14">
+<w:ftr xmlns:wpc="http://schemas.microsoft.com/office/word/2010/wordprocessingCanvas" xmlns:cx="http://schemas.microsoft.com/office/drawing/2014/chartex" xmlns:cx1="http://schemas.microsoft.com/office/drawing/2015/9/8/chartex" xmlns:cx2="http://schemas.microsoft.com/office/drawing/2015/10/21/chartex" xmlns:cx3="http://schemas.microsoft.com/office/drawing/2016/5/9/chartex" xmlns:cx4="http://schemas.microsoft.com/office/drawing/2016/5/10/chartex" xmlns:cx5="http://schemas.microsoft.com/office/drawing/2016/5/11/chartex" xmlns:cx6="http://schemas.microsoft.com/office/drawing/2016/5/12/chartex" xmlns:cx7="http://schemas.microsoft.com/office/drawing/2016/5/13/chartex" xmlns:cx8="http://schemas.microsoft.com/office/drawing/2016/5/14/chartex" xmlns:mc="http://schemas.openxmlformats.org/markup-compatibility/2006" xmlns:aink="http://schemas.microsoft.com/office/drawing/2016/ink" xmlns:am3d="http://schemas.microsoft.com/office/drawing/2017/model3d" xmlns:o="urn:schemas-microsoft-com:office:office" xmlns:oel="http://schemas.microsoft.com/office/2019/extlst" xmlns:r="http://schemas.openxmlformats.org/officeDocument/2006/relationships" xmlns:m="http://schemas.openxmlformats.org/officeDocument/2006/math" xmlns:v="urn:schemas-microsoft-com:vml" xmlns:wp14="http://schemas.microsoft.com/office/word/2010/wordprocessingDrawing" xmlns:wp="http://schemas.openxmlformats.org/drawingml/2006/wordprocessingDrawing" xmlns:w10="urn:schemas-microsoft-com:office:word" xmlns:w="http://schemas.openxmlformats.org/wordprocessingml/2006/main" xmlns:w14="http://schemas.microsoft.com/office/word/2010/wordml" xmlns:w15="http://schemas.microsoft.com/office/word/2012/wordml" xmlns:w16cex="http://schemas.microsoft.com/office/word/2018/wordml/cex" xmlns:w16cid="http://schemas.microsoft.com/office/word/2016/wordml/cid" xmlns:w16="http://schemas.microsoft.com/office/word/2018/wordml" xmlns:w16du="http://schemas.microsoft.com/office/word/2023/wordml/word16du" xmlns:w16sdtdh="http://schemas.microsoft.com/office/word/2020/wordml/sdtdatahash" xmlns:w16sdtfl="http://schemas.microsoft.com/office/word/2024/wordml/sdtformatlock" xmlns:w16se="http://schemas.microsoft.com/office/word/2015/wordml/symex" xmlns:wpg="http://schemas.microsoft.com/office/word/2010/wordprocessingGroup" xmlns:wpi="http://schemas.microsoft.com/office/word/2010/wordprocessingInk" xmlns:wne="http://schemas.microsoft.com/office/word/2006/wordml" xmlns:wps="http://schemas.microsoft.com/office/word/2010/wordprocessingShape" mc:Ignorable="w14 w15 w16se w16cid w16 w16cex w16sdtdh w16sdtfl w16du wp14">
   <w:p>
     <w:pPr>
       <w:pStyle w:val="a9"/>
@@ -11611,7 +11726,7 @@
 </file>
 
 <file path=word/footnotes.xml><?xml version="1.0" encoding="utf-8"?>
-<w:footnotes xmlns:wpc="http://schemas.microsoft.com/office/word/2010/wordprocessingCanvas" xmlns:cx="http://schemas.microsoft.com/office/drawing/2014/chartex" xmlns:cx1="http://schemas.microsoft.com/office/drawing/2015/9/8/chartex" xmlns:cx2="http://schemas.microsoft.com/office/drawing/2015/10/21/chartex" xmlns:cx3="http://schemas.microsoft.com/office/drawing/2016/5/9/chartex" xmlns:cx4="http://schemas.microsoft.com/office/drawing/2016/5/10/chartex" xmlns:cx5="http://schemas.microsoft.com/office/drawing/2016/5/11/chartex" xmlns:cx6="http://schemas.microsoft.com/office/drawing/2016/5/12/chartex" xmlns:cx7="http://schemas.microsoft.com/office/drawing/2016/5/13/chartex" xmlns:cx8="http://schemas.microsoft.com/office/drawing/2016/5/14/chartex" xmlns:mc="http://schemas.openxmlformats.org/markup-compatibility/2006" xmlns:aink="http://schemas.microsoft.com/office/drawing/2016/ink" xmlns:am3d="http://schemas.microsoft.com/office/drawing/2017/model3d" xmlns:o="urn:schemas-microsoft-com:office:office" xmlns:r="http://schemas.openxmlformats.org/officeDocument/2006/relationships" xmlns:m="http://schemas.openxmlformats.org/officeDocument/2006/math" xmlns:v="urn:schemas-microsoft-com:vml" xmlns:wp14="http://schemas.microsoft.com/office/word/2010/wordprocessingDrawing" xmlns:wp="http://schemas.openxmlformats.org/drawingml/2006/wordprocessingDrawing" xmlns:w10="urn:schemas-microsoft-com:office:word" xmlns:w="http://schemas.openxmlformats.org/wordprocessingml/2006/main" xmlns:w14="http://schemas.microsoft.com/office/word/2010/wordml" xmlns:w15="http://schemas.microsoft.com/office/word/2012/wordml" xmlns:w16cex="http://schemas.microsoft.com/office/word/2018/wordml/cex" xmlns:w16cid="http://schemas.microsoft.com/office/word/2016/wordml/cid" xmlns:w16="http://schemas.microsoft.com/office/word/2018/wordml" xmlns:w16sdtdh="http://schemas.microsoft.com/office/word/2020/wordml/sdtdatahash" xmlns:w16se="http://schemas.microsoft.com/office/word/2015/wordml/symex" xmlns:wpg="http://schemas.microsoft.com/office/word/2010/wordprocessingGroup" xmlns:wpi="http://schemas.microsoft.com/office/word/2010/wordprocessingInk" xmlns:wne="http://schemas.microsoft.com/office/word/2006/wordml" xmlns:wps="http://schemas.microsoft.com/office/word/2010/wordprocessingShape" mc:Ignorable="w14 w15 w16se w16cid w16 w16cex w16sdtdh wp14">
+<w:footnotes xmlns:wpc="http://schemas.microsoft.com/office/word/2010/wordprocessingCanvas" xmlns:cx="http://schemas.microsoft.com/office/drawing/2014/chartex" xmlns:cx1="http://schemas.microsoft.com/office/drawing/2015/9/8/chartex" xmlns:cx2="http://schemas.microsoft.com/office/drawing/2015/10/21/chartex" xmlns:cx3="http://schemas.microsoft.com/office/drawing/2016/5/9/chartex" xmlns:cx4="http://schemas.microsoft.com/office/drawing/2016/5/10/chartex" xmlns:cx5="http://schemas.microsoft.com/office/drawing/2016/5/11/chartex" xmlns:cx6="http://schemas.microsoft.com/office/drawing/2016/5/12/chartex" xmlns:cx7="http://schemas.microsoft.com/office/drawing/2016/5/13/chartex" xmlns:cx8="http://schemas.microsoft.com/office/drawing/2016/5/14/chartex" xmlns:mc="http://schemas.openxmlformats.org/markup-compatibility/2006" xmlns:aink="http://schemas.microsoft.com/office/drawing/2016/ink" xmlns:am3d="http://schemas.microsoft.com/office/drawing/2017/model3d" xmlns:o="urn:schemas-microsoft-com:office:office" xmlns:oel="http://schemas.microsoft.com/office/2019/extlst" xmlns:r="http://schemas.openxmlformats.org/officeDocument/2006/relationships" xmlns:m="http://schemas.openxmlformats.org/officeDocument/2006/math" xmlns:v="urn:schemas-microsoft-com:vml" xmlns:wp14="http://schemas.microsoft.com/office/word/2010/wordprocessingDrawing" xmlns:wp="http://schemas.openxmlformats.org/drawingml/2006/wordprocessingDrawing" xmlns:w10="urn:schemas-microsoft-com:office:word" xmlns:w="http://schemas.openxmlformats.org/wordprocessingml/2006/main" xmlns:w14="http://schemas.microsoft.com/office/word/2010/wordml" xmlns:w15="http://schemas.microsoft.com/office/word/2012/wordml" xmlns:w16cex="http://schemas.microsoft.com/office/word/2018/wordml/cex" xmlns:w16cid="http://schemas.microsoft.com/office/word/2016/wordml/cid" xmlns:w16="http://schemas.microsoft.com/office/word/2018/wordml" xmlns:w16du="http://schemas.microsoft.com/office/word/2023/wordml/word16du" xmlns:w16sdtdh="http://schemas.microsoft.com/office/word/2020/wordml/sdtdatahash" xmlns:w16sdtfl="http://schemas.microsoft.com/office/word/2024/wordml/sdtformatlock" xmlns:w16se="http://schemas.microsoft.com/office/word/2015/wordml/symex" xmlns:wpg="http://schemas.microsoft.com/office/word/2010/wordprocessingGroup" xmlns:wpi="http://schemas.microsoft.com/office/word/2010/wordprocessingInk" xmlns:wne="http://schemas.microsoft.com/office/word/2006/wordml" xmlns:wps="http://schemas.microsoft.com/office/word/2010/wordprocessingShape" mc:Ignorable="w14 w15 w16se w16cid w16 w16cex w16sdtdh w16sdtfl w16du wp14">
   <w:footnote w:type="separator" w:id="-1">
     <w:p>
       <w:r>
@@ -11630,7 +11745,7 @@
 </file>
 
 <file path=word/header1.xml><?xml version="1.0" encoding="utf-8"?>
-<w:hdr xmlns:wpc="http://schemas.microsoft.com/office/word/2010/wordprocessingCanvas" xmlns:cx="http://schemas.microsoft.com/office/drawing/2014/chartex" xmlns:cx1="http://schemas.microsoft.com/office/drawing/2015/9/8/chartex" xmlns:cx2="http://schemas.microsoft.com/office/drawing/2015/10/21/chartex" xmlns:cx3="http://schemas.microsoft.com/office/drawing/2016/5/9/chartex" xmlns:cx4="http://schemas.microsoft.com/office/drawing/2016/5/10/chartex" xmlns:cx5="http://schemas.microsoft.com/office/drawing/2016/5/11/chartex" xmlns:cx6="http://schemas.microsoft.com/office/drawing/2016/5/12/chartex" xmlns:cx7="http://schemas.microsoft.com/office/drawing/2016/5/13/chartex" xmlns:cx8="http://schemas.microsoft.com/office/drawing/2016/5/14/chartex" xmlns:mc="http://schemas.openxmlformats.org/markup-compatibility/2006" xmlns:aink="http://schemas.microsoft.com/office/drawing/2016/ink" xmlns:am3d="http://schemas.microsoft.com/office/drawing/2017/model3d" xmlns:o="urn:schemas-microsoft-com:office:office" xmlns:r="http://schemas.openxmlformats.org/officeDocument/2006/relationships" xmlns:m="http://schemas.openxmlformats.org/officeDocument/2006/math" xmlns:v="urn:schemas-microsoft-com:vml" xmlns:wp14="http://schemas.microsoft.com/office/word/2010/wordprocessingDrawing" xmlns:wp="http://schemas.openxmlformats.org/drawingml/2006/wordprocessingDrawing" xmlns:w10="urn:schemas-microsoft-com:office:word" xmlns:w="http://schemas.openxmlformats.org/wordprocessingml/2006/main" xmlns:w14="http://schemas.microsoft.com/office/word/2010/wordml" xmlns:w15="http://schemas.microsoft.com/office/word/2012/wordml" xmlns:w16cex="http://schemas.microsoft.com/office/word/2018/wordml/cex" xmlns:w16cid="http://schemas.microsoft.com/office/word/2016/wordml/cid" xmlns:w16="http://schemas.microsoft.com/office/word/2018/wordml" xmlns:w16sdtdh="http://schemas.microsoft.com/office/word/2020/wordml/sdtdatahash" xmlns:w16se="http://schemas.microsoft.com/office/word/2015/wordml/symex" xmlns:wpg="http://schemas.microsoft.com/office/word/2010/wordprocessingGroup" xmlns:wpi="http://schemas.microsoft.com/office/word/2010/wordprocessingInk" xmlns:wne="http://schemas.microsoft.com/office/word/2006/wordml" xmlns:wps="http://schemas.microsoft.com/office/word/2010/wordprocessingShape" mc:Ignorable="w14 w15 w16se w16cid w16 w16cex w16sdtdh wp14">
+<w:hdr xmlns:wpc="http://schemas.microsoft.com/office/word/2010/wordprocessingCanvas" xmlns:cx="http://schemas.microsoft.com/office/drawing/2014/chartex" xmlns:cx1="http://schemas.microsoft.com/office/drawing/2015/9/8/chartex" xmlns:cx2="http://schemas.microsoft.com/office/drawing/2015/10/21/chartex" xmlns:cx3="http://schemas.microsoft.com/office/drawing/2016/5/9/chartex" xmlns:cx4="http://schemas.microsoft.com/office/drawing/2016/5/10/chartex" xmlns:cx5="http://schemas.microsoft.com/office/drawing/2016/5/11/chartex" xmlns:cx6="http://schemas.microsoft.com/office/drawing/2016/5/12/chartex" xmlns:cx7="http://schemas.microsoft.com/office/drawing/2016/5/13/chartex" xmlns:cx8="http://schemas.microsoft.com/office/drawing/2016/5/14/chartex" xmlns:mc="http://schemas.openxmlformats.org/markup-compatibility/2006" xmlns:aink="http://schemas.microsoft.com/office/drawing/2016/ink" xmlns:am3d="http://schemas.microsoft.com/office/drawing/2017/model3d" xmlns:o="urn:schemas-microsoft-com:office:office" xmlns:oel="http://schemas.microsoft.com/office/2019/extlst" xmlns:r="http://schemas.openxmlformats.org/officeDocument/2006/relationships" xmlns:m="http://schemas.openxmlformats.org/officeDocument/2006/math" xmlns:v="urn:schemas-microsoft-com:vml" xmlns:wp14="http://schemas.microsoft.com/office/word/2010/wordprocessingDrawing" xmlns:wp="http://schemas.openxmlformats.org/drawingml/2006/wordprocessingDrawing" xmlns:w10="urn:schemas-microsoft-com:office:word" xmlns:w="http://schemas.openxmlformats.org/wordprocessingml/2006/main" xmlns:w14="http://schemas.microsoft.com/office/word/2010/wordml" xmlns:w15="http://schemas.microsoft.com/office/word/2012/wordml" xmlns:w16cex="http://schemas.microsoft.com/office/word/2018/wordml/cex" xmlns:w16cid="http://schemas.microsoft.com/office/word/2016/wordml/cid" xmlns:w16="http://schemas.microsoft.com/office/word/2018/wordml" xmlns:w16du="http://schemas.microsoft.com/office/word/2023/wordml/word16du" xmlns:w16sdtdh="http://schemas.microsoft.com/office/word/2020/wordml/sdtdatahash" xmlns:w16sdtfl="http://schemas.microsoft.com/office/word/2024/wordml/sdtformatlock" xmlns:w16se="http://schemas.microsoft.com/office/word/2015/wordml/symex" xmlns:wpg="http://schemas.microsoft.com/office/word/2010/wordprocessingGroup" xmlns:wpi="http://schemas.microsoft.com/office/word/2010/wordprocessingInk" xmlns:wne="http://schemas.microsoft.com/office/word/2006/wordml" xmlns:wps="http://schemas.microsoft.com/office/word/2010/wordprocessingShape" mc:Ignorable="w14 w15 w16se w16cid w16 w16cex w16sdtdh w16sdtfl w16du wp14">
   <w:p>
     <w:pPr>
       <w:pStyle w:val="a7"/>
@@ -11640,7 +11755,7 @@
 </file>
 
 <file path=word/header2.xml><?xml version="1.0" encoding="utf-8"?>
-<w:hdr xmlns:wpc="http://schemas.microsoft.com/office/word/2010/wordprocessingCanvas" xmlns:cx="http://schemas.microsoft.com/office/drawing/2014/chartex" xmlns:cx1="http://schemas.microsoft.com/office/drawing/2015/9/8/chartex" xmlns:cx2="http://schemas.microsoft.com/office/drawing/2015/10/21/chartex" xmlns:cx3="http://schemas.microsoft.com/office/drawing/2016/5/9/chartex" xmlns:cx4="http://schemas.microsoft.com/office/drawing/2016/5/10/chartex" xmlns:cx5="http://schemas.microsoft.com/office/drawing/2016/5/11/chartex" xmlns:cx6="http://schemas.microsoft.com/office/drawing/2016/5/12/chartex" xmlns:cx7="http://schemas.microsoft.com/office/drawing/2016/5/13/chartex" xmlns:cx8="http://schemas.microsoft.com/office/drawing/2016/5/14/chartex" xmlns:mc="http://schemas.openxmlformats.org/markup-compatibility/2006" xmlns:aink="http://schemas.microsoft.com/office/drawing/2016/ink" xmlns:am3d="http://schemas.microsoft.com/office/drawing/2017/model3d" xmlns:o="urn:schemas-microsoft-com:office:office" xmlns:r="http://schemas.openxmlformats.org/officeDocument/2006/relationships" xmlns:m="http://schemas.openxmlformats.org/officeDocument/2006/math" xmlns:v="urn:schemas-microsoft-com:vml" xmlns:wp14="http://schemas.microsoft.com/office/word/2010/wordprocessingDrawing" xmlns:wp="http://schemas.openxmlformats.org/drawingml/2006/wordprocessingDrawing" xmlns:w10="urn:schemas-microsoft-com:office:word" xmlns:w="http://schemas.openxmlformats.org/wordprocessingml/2006/main" xmlns:w14="http://schemas.microsoft.com/office/word/2010/wordml" xmlns:w15="http://schemas.microsoft.com/office/word/2012/wordml" xmlns:w16cex="http://schemas.microsoft.com/office/word/2018/wordml/cex" xmlns:w16cid="http://schemas.microsoft.com/office/word/2016/wordml/cid" xmlns:w16="http://schemas.microsoft.com/office/word/2018/wordml" xmlns:w16sdtdh="http://schemas.microsoft.com/office/word/2020/wordml/sdtdatahash" xmlns:w16se="http://schemas.microsoft.com/office/word/2015/wordml/symex" xmlns:wpg="http://schemas.microsoft.com/office/word/2010/wordprocessingGroup" xmlns:wpi="http://schemas.microsoft.com/office/word/2010/wordprocessingInk" xmlns:wne="http://schemas.microsoft.com/office/word/2006/wordml" xmlns:wps="http://schemas.microsoft.com/office/word/2010/wordprocessingShape" mc:Ignorable="w14 w15 w16se w16cid w16 w16cex w16sdtdh wp14">
+<w:hdr xmlns:wpc="http://schemas.microsoft.com/office/word/2010/wordprocessingCanvas" xmlns:cx="http://schemas.microsoft.com/office/drawing/2014/chartex" xmlns:cx1="http://schemas.microsoft.com/office/drawing/2015/9/8/chartex" xmlns:cx2="http://schemas.microsoft.com/office/drawing/2015/10/21/chartex" xmlns:cx3="http://schemas.microsoft.com/office/drawing/2016/5/9/chartex" xmlns:cx4="http://schemas.microsoft.com/office/drawing/2016/5/10/chartex" xmlns:cx5="http://schemas.microsoft.com/office/drawing/2016/5/11/chartex" xmlns:cx6="http://schemas.microsoft.com/office/drawing/2016/5/12/chartex" xmlns:cx7="http://schemas.microsoft.com/office/drawing/2016/5/13/chartex" xmlns:cx8="http://schemas.microsoft.com/office/drawing/2016/5/14/chartex" xmlns:mc="http://schemas.openxmlformats.org/markup-compatibility/2006" xmlns:aink="http://schemas.microsoft.com/office/drawing/2016/ink" xmlns:am3d="http://schemas.microsoft.com/office/drawing/2017/model3d" xmlns:o="urn:schemas-microsoft-com:office:office" xmlns:oel="http://schemas.microsoft.com/office/2019/extlst" xmlns:r="http://schemas.openxmlformats.org/officeDocument/2006/relationships" xmlns:m="http://schemas.openxmlformats.org/officeDocument/2006/math" xmlns:v="urn:schemas-microsoft-com:vml" xmlns:wp14="http://schemas.microsoft.com/office/word/2010/wordprocessingDrawing" xmlns:wp="http://schemas.openxmlformats.org/drawingml/2006/wordprocessingDrawing" xmlns:w10="urn:schemas-microsoft-com:office:word" xmlns:w="http://schemas.openxmlformats.org/wordprocessingml/2006/main" xmlns:w14="http://schemas.microsoft.com/office/word/2010/wordml" xmlns:w15="http://schemas.microsoft.com/office/word/2012/wordml" xmlns:w16cex="http://schemas.microsoft.com/office/word/2018/wordml/cex" xmlns:w16cid="http://schemas.microsoft.com/office/word/2016/wordml/cid" xmlns:w16="http://schemas.microsoft.com/office/word/2018/wordml" xmlns:w16du="http://schemas.microsoft.com/office/word/2023/wordml/word16du" xmlns:w16sdtdh="http://schemas.microsoft.com/office/word/2020/wordml/sdtdatahash" xmlns:w16sdtfl="http://schemas.microsoft.com/office/word/2024/wordml/sdtformatlock" xmlns:w16se="http://schemas.microsoft.com/office/word/2015/wordml/symex" xmlns:wpg="http://schemas.microsoft.com/office/word/2010/wordprocessingGroup" xmlns:wpi="http://schemas.microsoft.com/office/word/2010/wordprocessingInk" xmlns:wne="http://schemas.microsoft.com/office/word/2006/wordml" xmlns:wps="http://schemas.microsoft.com/office/word/2010/wordprocessingShape" mc:Ignorable="w14 w15 w16se w16cid w16 w16cex w16sdtdh w16sdtfl w16du wp14">
   <w:p>
     <w:pPr>
       <w:pStyle w:val="a7"/>
@@ -11650,7 +11765,7 @@
 </file>
 
 <file path=word/header3.xml><?xml version="1.0" encoding="utf-8"?>
-<w:hdr xmlns:wpc="http://schemas.microsoft.com/office/word/2010/wordprocessingCanvas" xmlns:cx="http://schemas.microsoft.com/office/drawing/2014/chartex" xmlns:cx1="http://schemas.microsoft.com/office/drawing/2015/9/8/chartex" xmlns:cx2="http://schemas.microsoft.com/office/drawing/2015/10/21/chartex" xmlns:cx3="http://schemas.microsoft.com/office/drawing/2016/5/9/chartex" xmlns:cx4="http://schemas.microsoft.com/office/drawing/2016/5/10/chartex" xmlns:cx5="http://schemas.microsoft.com/office/drawing/2016/5/11/chartex" xmlns:cx6="http://schemas.microsoft.com/office/drawing/2016/5/12/chartex" xmlns:cx7="http://schemas.microsoft.com/office/drawing/2016/5/13/chartex" xmlns:cx8="http://schemas.microsoft.com/office/drawing/2016/5/14/chartex" xmlns:mc="http://schemas.openxmlformats.org/markup-compatibility/2006" xmlns:aink="http://schemas.microsoft.com/office/drawing/2016/ink" xmlns:am3d="http://schemas.microsoft.com/office/drawing/2017/model3d" xmlns:o="urn:schemas-microsoft-com:office:office" xmlns:r="http://schemas.openxmlformats.org/officeDocument/2006/relationships" xmlns:m="http://schemas.openxmlformats.org/officeDocument/2006/math" xmlns:v="urn:schemas-microsoft-com:vml" xmlns:wp14="http://schemas.microsoft.com/office/word/2010/wordprocessingDrawing" xmlns:wp="http://schemas.openxmlformats.org/drawingml/2006/wordprocessingDrawing" xmlns:w10="urn:schemas-microsoft-com:office:word" xmlns:w="http://schemas.openxmlformats.org/wordprocessingml/2006/main" xmlns:w14="http://schemas.microsoft.com/office/word/2010/wordml" xmlns:w15="http://schemas.microsoft.com/office/word/2012/wordml" xmlns:w16cex="http://schemas.microsoft.com/office/word/2018/wordml/cex" xmlns:w16cid="http://schemas.microsoft.com/office/word/2016/wordml/cid" xmlns:w16="http://schemas.microsoft.com/office/word/2018/wordml" xmlns:w16sdtdh="http://schemas.microsoft.com/office/word/2020/wordml/sdtdatahash" xmlns:w16se="http://schemas.microsoft.com/office/word/2015/wordml/symex" xmlns:wpg="http://schemas.microsoft.com/office/word/2010/wordprocessingGroup" xmlns:wpi="http://schemas.microsoft.com/office/word/2010/wordprocessingInk" xmlns:wne="http://schemas.microsoft.com/office/word/2006/wordml" xmlns:wps="http://schemas.microsoft.com/office/word/2010/wordprocessingShape" mc:Ignorable="w14 w15 w16se w16cid w16 w16cex w16sdtdh wp14">
+<w:hdr xmlns:wpc="http://schemas.microsoft.com/office/word/2010/wordprocessingCanvas" xmlns:cx="http://schemas.microsoft.com/office/drawing/2014/chartex" xmlns:cx1="http://schemas.microsoft.com/office/drawing/2015/9/8/chartex" xmlns:cx2="http://schemas.microsoft.com/office/drawing/2015/10/21/chartex" xmlns:cx3="http://schemas.microsoft.com/office/drawing/2016/5/9/chartex" xmlns:cx4="http://schemas.microsoft.com/office/drawing/2016/5/10/chartex" xmlns:cx5="http://schemas.microsoft.com/office/drawing/2016/5/11/chartex" xmlns:cx6="http://schemas.microsoft.com/office/drawing/2016/5/12/chartex" xmlns:cx7="http://schemas.microsoft.com/office/drawing/2016/5/13/chartex" xmlns:cx8="http://schemas.microsoft.com/office/drawing/2016/5/14/chartex" xmlns:mc="http://schemas.openxmlformats.org/markup-compatibility/2006" xmlns:aink="http://schemas.microsoft.com/office/drawing/2016/ink" xmlns:am3d="http://schemas.microsoft.com/office/drawing/2017/model3d" xmlns:o="urn:schemas-microsoft-com:office:office" xmlns:oel="http://schemas.microsoft.com/office/2019/extlst" xmlns:r="http://schemas.openxmlformats.org/officeDocument/2006/relationships" xmlns:m="http://schemas.openxmlformats.org/officeDocument/2006/math" xmlns:v="urn:schemas-microsoft-com:vml" xmlns:wp14="http://schemas.microsoft.com/office/word/2010/wordprocessingDrawing" xmlns:wp="http://schemas.openxmlformats.org/drawingml/2006/wordprocessingDrawing" xmlns:w10="urn:schemas-microsoft-com:office:word" xmlns:w="http://schemas.openxmlformats.org/wordprocessingml/2006/main" xmlns:w14="http://schemas.microsoft.com/office/word/2010/wordml" xmlns:w15="http://schemas.microsoft.com/office/word/2012/wordml" xmlns:w16cex="http://schemas.microsoft.com/office/word/2018/wordml/cex" xmlns:w16cid="http://schemas.microsoft.com/office/word/2016/wordml/cid" xmlns:w16="http://schemas.microsoft.com/office/word/2018/wordml" xmlns:w16du="http://schemas.microsoft.com/office/word/2023/wordml/word16du" xmlns:w16sdtdh="http://schemas.microsoft.com/office/word/2020/wordml/sdtdatahash" xmlns:w16sdtfl="http://schemas.microsoft.com/office/word/2024/wordml/sdtformatlock" xmlns:w16se="http://schemas.microsoft.com/office/word/2015/wordml/symex" xmlns:wpg="http://schemas.microsoft.com/office/word/2010/wordprocessingGroup" xmlns:wpi="http://schemas.microsoft.com/office/word/2010/wordprocessingInk" xmlns:wne="http://schemas.microsoft.com/office/word/2006/wordml" xmlns:wps="http://schemas.microsoft.com/office/word/2010/wordprocessingShape" mc:Ignorable="w14 w15 w16se w16cid w16 w16cex w16sdtdh w16sdtfl w16du wp14">
   <w:p>
     <w:pPr>
       <w:pStyle w:val="a7"/>
@@ -11660,7 +11775,7 @@
 </file>
 
 <file path=word/numbering.xml><?xml version="1.0" encoding="utf-8"?>
-<w:numbering xmlns:wpc="http://schemas.microsoft.com/office/word/2010/wordprocessingCanvas" xmlns:cx="http://schemas.microsoft.com/office/drawing/2014/chartex" xmlns:cx1="http://schemas.microsoft.com/office/drawing/2015/9/8/chartex" xmlns:cx2="http://schemas.microsoft.com/office/drawing/2015/10/21/chartex" xmlns:cx3="http://schemas.microsoft.com/office/drawing/2016/5/9/chartex" xmlns:cx4="http://schemas.microsoft.com/office/drawing/2016/5/10/chartex" xmlns:cx5="http://schemas.microsoft.com/office/drawing/2016/5/11/chartex" xmlns:cx6="http://schemas.microsoft.com/office/drawing/2016/5/12/chartex" xmlns:cx7="http://schemas.microsoft.com/office/drawing/2016/5/13/chartex" xmlns:cx8="http://schemas.microsoft.com/office/drawing/2016/5/14/chartex" xmlns:mc="http://schemas.openxmlformats.org/markup-compatibility/2006" xmlns:aink="http://schemas.microsoft.com/office/drawing/2016/ink" xmlns:am3d="http://schemas.microsoft.com/office/drawing/2017/model3d" xmlns:o="urn:schemas-microsoft-com:office:office" xmlns:r="http://schemas.openxmlformats.org/officeDocument/2006/relationships" xmlns:m="http://schemas.openxmlformats.org/officeDocument/2006/math" xmlns:v="urn:schemas-microsoft-com:vml" xmlns:wp14="http://schemas.microsoft.com/office/word/2010/wordprocessingDrawing" xmlns:wp="http://schemas.openxmlformats.org/drawingml/2006/wordprocessingDrawing" xmlns:w10="urn:schemas-microsoft-com:office:word" xmlns:w="http://schemas.openxmlformats.org/wordprocessingml/2006/main" xmlns:w14="http://schemas.microsoft.com/office/word/2010/wordml" xmlns:w15="http://schemas.microsoft.com/office/word/2012/wordml" xmlns:w16cex="http://schemas.microsoft.com/office/word/2018/wordml/cex" xmlns:w16cid="http://schemas.microsoft.com/office/word/2016/wordml/cid" xmlns:w16="http://schemas.microsoft.com/office/word/2018/wordml" xmlns:w16sdtdh="http://schemas.microsoft.com/office/word/2020/wordml/sdtdatahash" xmlns:w16se="http://schemas.microsoft.com/office/word/2015/wordml/symex" xmlns:wpg="http://schemas.microsoft.com/office/word/2010/wordprocessingGroup" xmlns:wpi="http://schemas.microsoft.com/office/word/2010/wordprocessingInk" xmlns:wne="http://schemas.microsoft.com/office/word/2006/wordml" xmlns:wps="http://schemas.microsoft.com/office/word/2010/wordprocessingShape" mc:Ignorable="w14 w15 w16se w16cid w16 w16cex w16sdtdh wp14">
+<w:numbering xmlns:wpc="http://schemas.microsoft.com/office/word/2010/wordprocessingCanvas" xmlns:cx="http://schemas.microsoft.com/office/drawing/2014/chartex" xmlns:cx1="http://schemas.microsoft.com/office/drawing/2015/9/8/chartex" xmlns:cx2="http://schemas.microsoft.com/office/drawing/2015/10/21/chartex" xmlns:cx3="http://schemas.microsoft.com/office/drawing/2016/5/9/chartex" xmlns:cx4="http://schemas.microsoft.com/office/drawing/2016/5/10/chartex" xmlns:cx5="http://schemas.microsoft.com/office/drawing/2016/5/11/chartex" xmlns:cx6="http://schemas.microsoft.com/office/drawing/2016/5/12/chartex" xmlns:cx7="http://schemas.microsoft.com/office/drawing/2016/5/13/chartex" xmlns:cx8="http://schemas.microsoft.com/office/drawing/2016/5/14/chartex" xmlns:mc="http://schemas.openxmlformats.org/markup-compatibility/2006" xmlns:aink="http://schemas.microsoft.com/office/drawing/2016/ink" xmlns:am3d="http://schemas.microsoft.com/office/drawing/2017/model3d" xmlns:o="urn:schemas-microsoft-com:office:office" xmlns:oel="http://schemas.microsoft.com/office/2019/extlst" xmlns:r="http://schemas.openxmlformats.org/officeDocument/2006/relationships" xmlns:m="http://schemas.openxmlformats.org/officeDocument/2006/math" xmlns:v="urn:schemas-microsoft-com:vml" xmlns:wp14="http://schemas.microsoft.com/office/word/2010/wordprocessingDrawing" xmlns:wp="http://schemas.openxmlformats.org/drawingml/2006/wordprocessingDrawing" xmlns:w10="urn:schemas-microsoft-com:office:word" xmlns:w="http://schemas.openxmlformats.org/wordprocessingml/2006/main" xmlns:w14="http://schemas.microsoft.com/office/word/2010/wordml" xmlns:w15="http://schemas.microsoft.com/office/word/2012/wordml" xmlns:w16cex="http://schemas.microsoft.com/office/word/2018/wordml/cex" xmlns:w16cid="http://schemas.microsoft.com/office/word/2016/wordml/cid" xmlns:w16="http://schemas.microsoft.com/office/word/2018/wordml" xmlns:w16du="http://schemas.microsoft.com/office/word/2023/wordml/word16du" xmlns:w16sdtdh="http://schemas.microsoft.com/office/word/2020/wordml/sdtdatahash" xmlns:w16sdtfl="http://schemas.microsoft.com/office/word/2024/wordml/sdtformatlock" xmlns:w16se="http://schemas.microsoft.com/office/word/2015/wordml/symex" xmlns:wpg="http://schemas.microsoft.com/office/word/2010/wordprocessingGroup" xmlns:wpi="http://schemas.microsoft.com/office/word/2010/wordprocessingInk" xmlns:wne="http://schemas.microsoft.com/office/word/2006/wordml" xmlns:wps="http://schemas.microsoft.com/office/word/2010/wordprocessingShape" mc:Ignorable="w14 w15 w16se w16cid w16 w16cex w16sdtdh w16sdtfl w16du wp14">
   <w:abstractNum w:abstractNumId="0" w15:restartNumberingAfterBreak="0">
     <w:nsid w:val="0FAD1A09"/>
     <w:multiLevelType w:val="multilevel"/>
@@ -12352,35 +12467,35 @@
       </w:pPr>
     </w:lvl>
   </w:abstractNum>
-  <w:num w:numId="1">
+  <w:num w:numId="1" w16cid:durableId="399517942">
     <w:abstractNumId w:val="3"/>
   </w:num>
-  <w:num w:numId="2">
+  <w:num w:numId="2" w16cid:durableId="443500468">
     <w:abstractNumId w:val="1"/>
   </w:num>
-  <w:num w:numId="3">
+  <w:num w:numId="3" w16cid:durableId="489054233">
     <w:abstractNumId w:val="7"/>
   </w:num>
-  <w:num w:numId="4">
+  <w:num w:numId="4" w16cid:durableId="1134054903">
     <w:abstractNumId w:val="0"/>
   </w:num>
-  <w:num w:numId="5">
+  <w:num w:numId="5" w16cid:durableId="663818197">
     <w:abstractNumId w:val="2"/>
   </w:num>
-  <w:num w:numId="6">
+  <w:num w:numId="6" w16cid:durableId="688333881">
     <w:abstractNumId w:val="4"/>
   </w:num>
-  <w:num w:numId="7">
+  <w:num w:numId="7" w16cid:durableId="754859867">
     <w:abstractNumId w:val="5"/>
   </w:num>
-  <w:num w:numId="8">
+  <w:num w:numId="8" w16cid:durableId="2036686952">
     <w:abstractNumId w:val="6"/>
   </w:num>
 </w:numbering>
 </file>
 
 <file path=word/styles.xml><?xml version="1.0" encoding="utf-8"?>
-<w:styles xmlns:mc="http://schemas.openxmlformats.org/markup-compatibility/2006" xmlns:r="http://schemas.openxmlformats.org/officeDocument/2006/relationships" xmlns:w="http://schemas.openxmlformats.org/wordprocessingml/2006/main" xmlns:w14="http://schemas.microsoft.com/office/word/2010/wordml" xmlns:w15="http://schemas.microsoft.com/office/word/2012/wordml" xmlns:w16cex="http://schemas.microsoft.com/office/word/2018/wordml/cex" xmlns:w16cid="http://schemas.microsoft.com/office/word/2016/wordml/cid" xmlns:w16="http://schemas.microsoft.com/office/word/2018/wordml" xmlns:w16sdtdh="http://schemas.microsoft.com/office/word/2020/wordml/sdtdatahash" xmlns:w16se="http://schemas.microsoft.com/office/word/2015/wordml/symex" mc:Ignorable="w14 w15 w16se w16cid w16 w16cex w16sdtdh">
+<w:styles xmlns:mc="http://schemas.openxmlformats.org/markup-compatibility/2006" xmlns:r="http://schemas.openxmlformats.org/officeDocument/2006/relationships" xmlns:w="http://schemas.openxmlformats.org/wordprocessingml/2006/main" xmlns:w14="http://schemas.microsoft.com/office/word/2010/wordml" xmlns:w15="http://schemas.microsoft.com/office/word/2012/wordml" xmlns:w16cex="http://schemas.microsoft.com/office/word/2018/wordml/cex" xmlns:w16cid="http://schemas.microsoft.com/office/word/2016/wordml/cid" xmlns:w16="http://schemas.microsoft.com/office/word/2018/wordml" xmlns:w16du="http://schemas.microsoft.com/office/word/2023/wordml/word16du" xmlns:w16sdtdh="http://schemas.microsoft.com/office/word/2020/wordml/sdtdatahash" xmlns:w16sdtfl="http://schemas.microsoft.com/office/word/2024/wordml/sdtformatlock" xmlns:w16se="http://schemas.microsoft.com/office/word/2015/wordml/symex" mc:Ignorable="w14 w15 w16se w16cid w16 w16cex w16sdtdh w16sdtfl w16du">
   <w:docDefaults>
     <w:rPrDefault>
       <w:rPr>

</xml_diff>

<commit_message>
add 3Lab MS refactor lab TOI_8 and TOI_9
</commit_message>
<xml_diff>
--- a/TOI/TOI_8/Migachev_8.1_1.docx
+++ b/TOI/TOI_8/Migachev_8.1_1.docx
@@ -1,6 +1,6 @@
 
 <file path=word/document.xml><?xml version="1.0" encoding="utf-8"?>
-<w:document xmlns:wpc="http://schemas.microsoft.com/office/word/2010/wordprocessingCanvas" xmlns:cx="http://schemas.microsoft.com/office/drawing/2014/chartex" xmlns:cx1="http://schemas.microsoft.com/office/drawing/2015/9/8/chartex" xmlns:cx2="http://schemas.microsoft.com/office/drawing/2015/10/21/chartex" xmlns:cx3="http://schemas.microsoft.com/office/drawing/2016/5/9/chartex" xmlns:cx4="http://schemas.microsoft.com/office/drawing/2016/5/10/chartex" xmlns:cx5="http://schemas.microsoft.com/office/drawing/2016/5/11/chartex" xmlns:cx6="http://schemas.microsoft.com/office/drawing/2016/5/12/chartex" xmlns:cx7="http://schemas.microsoft.com/office/drawing/2016/5/13/chartex" xmlns:cx8="http://schemas.microsoft.com/office/drawing/2016/5/14/chartex" xmlns:mc="http://schemas.openxmlformats.org/markup-compatibility/2006" xmlns:aink="http://schemas.microsoft.com/office/drawing/2016/ink" xmlns:am3d="http://schemas.microsoft.com/office/drawing/2017/model3d" xmlns:o="urn:schemas-microsoft-com:office:office" xmlns:oel="http://schemas.microsoft.com/office/2019/extlst" xmlns:r="http://schemas.openxmlformats.org/officeDocument/2006/relationships" xmlns:m="http://schemas.openxmlformats.org/officeDocument/2006/math" xmlns:v="urn:schemas-microsoft-com:vml" xmlns:wp14="http://schemas.microsoft.com/office/word/2010/wordprocessingDrawing" xmlns:wp="http://schemas.openxmlformats.org/drawingml/2006/wordprocessingDrawing" xmlns:w10="urn:schemas-microsoft-com:office:word" xmlns:w="http://schemas.openxmlformats.org/wordprocessingml/2006/main" xmlns:w14="http://schemas.microsoft.com/office/word/2010/wordml" xmlns:w15="http://schemas.microsoft.com/office/word/2012/wordml" xmlns:w16cex="http://schemas.microsoft.com/office/word/2018/wordml/cex" xmlns:w16cid="http://schemas.microsoft.com/office/word/2016/wordml/cid" xmlns:w16="http://schemas.microsoft.com/office/word/2018/wordml" xmlns:w16du="http://schemas.microsoft.com/office/word/2023/wordml/word16du" xmlns:w16sdtdh="http://schemas.microsoft.com/office/word/2020/wordml/sdtdatahash" xmlns:w16sdtfl="http://schemas.microsoft.com/office/word/2024/wordml/sdtformatlock" xmlns:w16se="http://schemas.microsoft.com/office/word/2015/wordml/symex" xmlns:wpg="http://schemas.microsoft.com/office/word/2010/wordprocessingGroup" xmlns:wpi="http://schemas.microsoft.com/office/word/2010/wordprocessingInk" xmlns:wne="http://schemas.microsoft.com/office/word/2006/wordml" xmlns:wps="http://schemas.microsoft.com/office/word/2010/wordprocessingShape" mc:Ignorable="w14 w15 w16se w16cid w16 w16cex w16sdtdh w16sdtfl w16du wp14">
+<w:document xmlns:wpc="http://schemas.microsoft.com/office/word/2010/wordprocessingCanvas" xmlns:cx="http://schemas.microsoft.com/office/drawing/2014/chartex" xmlns:cx1="http://schemas.microsoft.com/office/drawing/2015/9/8/chartex" xmlns:cx2="http://schemas.microsoft.com/office/drawing/2015/10/21/chartex" xmlns:cx3="http://schemas.microsoft.com/office/drawing/2016/5/9/chartex" xmlns:cx4="http://schemas.microsoft.com/office/drawing/2016/5/10/chartex" xmlns:cx5="http://schemas.microsoft.com/office/drawing/2016/5/11/chartex" xmlns:cx6="http://schemas.microsoft.com/office/drawing/2016/5/12/chartex" xmlns:cx7="http://schemas.microsoft.com/office/drawing/2016/5/13/chartex" xmlns:cx8="http://schemas.microsoft.com/office/drawing/2016/5/14/chartex" xmlns:mc="http://schemas.openxmlformats.org/markup-compatibility/2006" xmlns:aink="http://schemas.microsoft.com/office/drawing/2016/ink" xmlns:am3d="http://schemas.microsoft.com/office/drawing/2017/model3d" xmlns:o="urn:schemas-microsoft-com:office:office" xmlns:r="http://schemas.openxmlformats.org/officeDocument/2006/relationships" xmlns:m="http://schemas.openxmlformats.org/officeDocument/2006/math" xmlns:v="urn:schemas-microsoft-com:vml" xmlns:wp14="http://schemas.microsoft.com/office/word/2010/wordprocessingDrawing" xmlns:wp="http://schemas.openxmlformats.org/drawingml/2006/wordprocessingDrawing" xmlns:w10="urn:schemas-microsoft-com:office:word" xmlns:w="http://schemas.openxmlformats.org/wordprocessingml/2006/main" xmlns:w14="http://schemas.microsoft.com/office/word/2010/wordml" xmlns:w15="http://schemas.microsoft.com/office/word/2012/wordml" xmlns:w16cex="http://schemas.microsoft.com/office/word/2018/wordml/cex" xmlns:w16cid="http://schemas.microsoft.com/office/word/2016/wordml/cid" xmlns:w16="http://schemas.microsoft.com/office/word/2018/wordml" xmlns:w16sdtdh="http://schemas.microsoft.com/office/word/2020/wordml/sdtdatahash" xmlns:w16se="http://schemas.microsoft.com/office/word/2015/wordml/symex" xmlns:wpg="http://schemas.microsoft.com/office/word/2010/wordprocessingGroup" xmlns:wpi="http://schemas.microsoft.com/office/word/2010/wordprocessingInk" xmlns:wne="http://schemas.microsoft.com/office/word/2006/wordml" xmlns:wps="http://schemas.microsoft.com/office/word/2010/wordprocessingShape" mc:Ignorable="w14 w15 w16se w16cid w16 w16cex w16sdtdh wp14">
   <w:background w:color="FFFFFF"/>
   <w:body>
     <w:p>
@@ -453,15 +453,44 @@
         </w:rPr>
         <w:t xml:space="preserve"> </w:t>
       </w:r>
+      <w:r>
+        <w:rPr>
+          <w:rFonts w:ascii="Courier New" w:hAnsi="Courier New" w:cs="Courier New"/>
+          <w:color w:val="0033B3"/>
+          <w:sz w:val="20"/>
+          <w:szCs w:val="20"/>
+        </w:rPr>
+        <w:t xml:space="preserve">as </w:t>
+      </w:r>
       <w:proofErr w:type="spellStart"/>
       <w:r>
         <w:rPr>
           <w:rFonts w:ascii="Courier New" w:hAnsi="Courier New" w:cs="Courier New"/>
+          <w:color w:val="080808"/>
+          <w:sz w:val="20"/>
+          <w:szCs w:val="20"/>
+        </w:rPr>
+        <w:t>np</w:t>
+      </w:r>
+      <w:proofErr w:type="spellEnd"/>
+      <w:r>
+        <w:rPr>
+          <w:rFonts w:ascii="Courier New" w:hAnsi="Courier New" w:cs="Courier New"/>
+          <w:color w:val="080808"/>
+          <w:sz w:val="20"/>
+          <w:szCs w:val="20"/>
+        </w:rPr>
+        <w:br/>
+      </w:r>
+      <w:proofErr w:type="spellStart"/>
+      <w:r>
+        <w:rPr>
+          <w:rFonts w:ascii="Courier New" w:hAnsi="Courier New" w:cs="Courier New"/>
           <w:color w:val="0033B3"/>
           <w:sz w:val="20"/>
           <w:szCs w:val="20"/>
         </w:rPr>
-        <w:t>as</w:t>
+        <w:t>import</w:t>
       </w:r>
       <w:proofErr w:type="spellEnd"/>
       <w:r>
@@ -481,7 +510,7 @@
           <w:sz w:val="20"/>
           <w:szCs w:val="20"/>
         </w:rPr>
-        <w:t>np</w:t>
+        <w:t>statsmodels.api</w:t>
       </w:r>
       <w:proofErr w:type="spellEnd"/>
       <w:r>
@@ -491,6 +520,35 @@
           <w:sz w:val="20"/>
           <w:szCs w:val="20"/>
         </w:rPr>
+        <w:t xml:space="preserve"> </w:t>
+      </w:r>
+      <w:r>
+        <w:rPr>
+          <w:rFonts w:ascii="Courier New" w:hAnsi="Courier New" w:cs="Courier New"/>
+          <w:color w:val="0033B3"/>
+          <w:sz w:val="20"/>
+          <w:szCs w:val="20"/>
+        </w:rPr>
+        <w:t xml:space="preserve">as </w:t>
+      </w:r>
+      <w:proofErr w:type="spellStart"/>
+      <w:r>
+        <w:rPr>
+          <w:rFonts w:ascii="Courier New" w:hAnsi="Courier New" w:cs="Courier New"/>
+          <w:color w:val="080808"/>
+          <w:sz w:val="20"/>
+          <w:szCs w:val="20"/>
+        </w:rPr>
+        <w:t>sm</w:t>
+      </w:r>
+      <w:proofErr w:type="spellEnd"/>
+      <w:r>
+        <w:rPr>
+          <w:rFonts w:ascii="Courier New" w:hAnsi="Courier New" w:cs="Courier New"/>
+          <w:color w:val="080808"/>
+          <w:sz w:val="20"/>
+          <w:szCs w:val="20"/>
+        </w:rPr>
         <w:br/>
       </w:r>
       <w:proofErr w:type="spellStart"/>
@@ -521,7 +579,7 @@
           <w:sz w:val="20"/>
           <w:szCs w:val="20"/>
         </w:rPr>
-        <w:t>statsmodels.api</w:t>
+        <w:t>matplotlib.pyplot</w:t>
       </w:r>
       <w:proofErr w:type="spellEnd"/>
       <w:r>
@@ -533,7 +591,6 @@
         </w:rPr>
         <w:t xml:space="preserve"> </w:t>
       </w:r>
-      <w:proofErr w:type="spellStart"/>
       <w:r>
         <w:rPr>
           <w:rFonts w:ascii="Courier New" w:hAnsi="Courier New" w:cs="Courier New"/>
@@ -541,97 +598,7 @@
           <w:sz w:val="20"/>
           <w:szCs w:val="20"/>
         </w:rPr>
-        <w:t>as</w:t>
-      </w:r>
-      <w:proofErr w:type="spellEnd"/>
-      <w:r>
-        <w:rPr>
-          <w:rFonts w:ascii="Courier New" w:hAnsi="Courier New" w:cs="Courier New"/>
-          <w:color w:val="0033B3"/>
-          <w:sz w:val="20"/>
-          <w:szCs w:val="20"/>
-        </w:rPr>
-        <w:t xml:space="preserve"> </w:t>
-      </w:r>
-      <w:proofErr w:type="spellStart"/>
-      <w:r>
-        <w:rPr>
-          <w:rFonts w:ascii="Courier New" w:hAnsi="Courier New" w:cs="Courier New"/>
-          <w:color w:val="080808"/>
-          <w:sz w:val="20"/>
-          <w:szCs w:val="20"/>
-        </w:rPr>
-        <w:t>sm</w:t>
-      </w:r>
-      <w:proofErr w:type="spellEnd"/>
-      <w:r>
-        <w:rPr>
-          <w:rFonts w:ascii="Courier New" w:hAnsi="Courier New" w:cs="Courier New"/>
-          <w:color w:val="080808"/>
-          <w:sz w:val="20"/>
-          <w:szCs w:val="20"/>
-        </w:rPr>
-        <w:br/>
-      </w:r>
-      <w:proofErr w:type="spellStart"/>
-      <w:r>
-        <w:rPr>
-          <w:rFonts w:ascii="Courier New" w:hAnsi="Courier New" w:cs="Courier New"/>
-          <w:color w:val="0033B3"/>
-          <w:sz w:val="20"/>
-          <w:szCs w:val="20"/>
-        </w:rPr>
-        <w:t>import</w:t>
-      </w:r>
-      <w:proofErr w:type="spellEnd"/>
-      <w:r>
-        <w:rPr>
-          <w:rFonts w:ascii="Courier New" w:hAnsi="Courier New" w:cs="Courier New"/>
-          <w:color w:val="0033B3"/>
-          <w:sz w:val="20"/>
-          <w:szCs w:val="20"/>
-        </w:rPr>
-        <w:t xml:space="preserve"> </w:t>
-      </w:r>
-      <w:proofErr w:type="spellStart"/>
-      <w:r>
-        <w:rPr>
-          <w:rFonts w:ascii="Courier New" w:hAnsi="Courier New" w:cs="Courier New"/>
-          <w:color w:val="080808"/>
-          <w:sz w:val="20"/>
-          <w:szCs w:val="20"/>
-        </w:rPr>
-        <w:t>matplotlib.pyplot</w:t>
-      </w:r>
-      <w:proofErr w:type="spellEnd"/>
-      <w:r>
-        <w:rPr>
-          <w:rFonts w:ascii="Courier New" w:hAnsi="Courier New" w:cs="Courier New"/>
-          <w:color w:val="080808"/>
-          <w:sz w:val="20"/>
-          <w:szCs w:val="20"/>
-        </w:rPr>
-        <w:t xml:space="preserve"> </w:t>
-      </w:r>
-      <w:proofErr w:type="spellStart"/>
-      <w:r>
-        <w:rPr>
-          <w:rFonts w:ascii="Courier New" w:hAnsi="Courier New" w:cs="Courier New"/>
-          <w:color w:val="0033B3"/>
-          <w:sz w:val="20"/>
-          <w:szCs w:val="20"/>
-        </w:rPr>
-        <w:t>as</w:t>
-      </w:r>
-      <w:proofErr w:type="spellEnd"/>
-      <w:r>
-        <w:rPr>
-          <w:rFonts w:ascii="Courier New" w:hAnsi="Courier New" w:cs="Courier New"/>
-          <w:color w:val="0033B3"/>
-          <w:sz w:val="20"/>
-          <w:szCs w:val="20"/>
-        </w:rPr>
-        <w:t xml:space="preserve"> </w:t>
+        <w:t xml:space="preserve">as </w:t>
       </w:r>
       <w:proofErr w:type="spellStart"/>
       <w:r>
@@ -11575,84 +11542,50 @@
         <w:rPr>
           <w:rFonts w:ascii="Arial" w:hAnsi="Arial" w:cs="Arial"/>
         </w:rPr>
-        <w:t xml:space="preserve">В этой работе </w:t>
+        <w:t xml:space="preserve">В этой работе было исследовано, как работает полиномиальная регрессия пятой степени и как она восстанавливает заданную функцию по шумным данным. </w:t>
       </w:r>
       <w:r>
         <w:rPr>
           <w:rFonts w:ascii="Arial" w:hAnsi="Arial" w:cs="Arial"/>
         </w:rPr>
-        <w:t>было</w:t>
+        <w:t>Была</w:t>
       </w:r>
       <w:r>
         <w:rPr>
           <w:rFonts w:ascii="Arial" w:hAnsi="Arial" w:cs="Arial"/>
         </w:rPr>
-        <w:t xml:space="preserve"> исследова</w:t>
+        <w:t xml:space="preserve"> постро</w:t>
       </w:r>
       <w:r>
         <w:rPr>
           <w:rFonts w:ascii="Arial" w:hAnsi="Arial" w:cs="Arial"/>
         </w:rPr>
-        <w:t>но</w:t>
+        <w:t>ена</w:t>
       </w:r>
       <w:r>
         <w:rPr>
           <w:rFonts w:ascii="Arial" w:hAnsi="Arial" w:cs="Arial"/>
         </w:rPr>
-        <w:t xml:space="preserve">, как работает полиномиальная регрессия пятой степени и как она восстанавливает заданную функцию по шумным данным. </w:t>
+        <w:t xml:space="preserve"> модель методом наименьших квадратов для разных объёмов </w:t>
       </w:r>
       <w:r>
         <w:rPr>
           <w:rFonts w:ascii="Arial" w:hAnsi="Arial" w:cs="Arial"/>
         </w:rPr>
-        <w:t>Была</w:t>
+        <w:t>выборки,</w:t>
       </w:r>
       <w:r>
         <w:rPr>
           <w:rFonts w:ascii="Arial" w:hAnsi="Arial" w:cs="Arial"/>
         </w:rPr>
-        <w:t xml:space="preserve"> постро</w:t>
+        <w:t xml:space="preserve"> и </w:t>
       </w:r>
       <w:r>
         <w:rPr>
           <w:rFonts w:ascii="Arial" w:hAnsi="Arial" w:cs="Arial"/>
         </w:rPr>
-        <w:t>ена</w:t>
-      </w:r>
-      <w:r>
-        <w:rPr>
-          <w:rFonts w:ascii="Arial" w:hAnsi="Arial" w:cs="Arial"/>
-        </w:rPr>
-        <w:t xml:space="preserve"> модель методом наименьших квадратов для разных объёмов </w:t>
-      </w:r>
-      <w:proofErr w:type="gramStart"/>
-      <w:r>
-        <w:rPr>
-          <w:rFonts w:ascii="Arial" w:hAnsi="Arial" w:cs="Arial"/>
-        </w:rPr>
-        <w:t>выборки</w:t>
-      </w:r>
-      <w:proofErr w:type="gramEnd"/>
-      <w:r>
-        <w:rPr>
-          <w:rFonts w:ascii="Arial" w:hAnsi="Arial" w:cs="Arial"/>
-        </w:rPr>
-        <w:t xml:space="preserve"> и </w:t>
-      </w:r>
-      <w:r>
-        <w:rPr>
-          <w:rFonts w:ascii="Arial" w:hAnsi="Arial" w:cs="Arial"/>
-        </w:rPr>
-        <w:t xml:space="preserve">мы </w:t>
-      </w:r>
-      <w:proofErr w:type="spellStart"/>
-      <w:r>
-        <w:rPr>
-          <w:rFonts w:ascii="Arial" w:hAnsi="Arial" w:cs="Arial"/>
-        </w:rPr>
-        <w:t>видимм</w:t>
-      </w:r>
-      <w:proofErr w:type="spellEnd"/>
+        <w:t>мы видим</w:t>
+      </w:r>
       <w:r>
         <w:rPr>
           <w:rFonts w:ascii="Arial" w:hAnsi="Arial" w:cs="Arial"/>
@@ -11677,7 +11610,7 @@
 </file>
 
 <file path=word/endnotes.xml><?xml version="1.0" encoding="utf-8"?>
-<w:endnotes xmlns:wpc="http://schemas.microsoft.com/office/word/2010/wordprocessingCanvas" xmlns:cx="http://schemas.microsoft.com/office/drawing/2014/chartex" xmlns:cx1="http://schemas.microsoft.com/office/drawing/2015/9/8/chartex" xmlns:cx2="http://schemas.microsoft.com/office/drawing/2015/10/21/chartex" xmlns:cx3="http://schemas.microsoft.com/office/drawing/2016/5/9/chartex" xmlns:cx4="http://schemas.microsoft.com/office/drawing/2016/5/10/chartex" xmlns:cx5="http://schemas.microsoft.com/office/drawing/2016/5/11/chartex" xmlns:cx6="http://schemas.microsoft.com/office/drawing/2016/5/12/chartex" xmlns:cx7="http://schemas.microsoft.com/office/drawing/2016/5/13/chartex" xmlns:cx8="http://schemas.microsoft.com/office/drawing/2016/5/14/chartex" xmlns:mc="http://schemas.openxmlformats.org/markup-compatibility/2006" xmlns:aink="http://schemas.microsoft.com/office/drawing/2016/ink" xmlns:am3d="http://schemas.microsoft.com/office/drawing/2017/model3d" xmlns:o="urn:schemas-microsoft-com:office:office" xmlns:oel="http://schemas.microsoft.com/office/2019/extlst" xmlns:r="http://schemas.openxmlformats.org/officeDocument/2006/relationships" xmlns:m="http://schemas.openxmlformats.org/officeDocument/2006/math" xmlns:v="urn:schemas-microsoft-com:vml" xmlns:wp14="http://schemas.microsoft.com/office/word/2010/wordprocessingDrawing" xmlns:wp="http://schemas.openxmlformats.org/drawingml/2006/wordprocessingDrawing" xmlns:w10="urn:schemas-microsoft-com:office:word" xmlns:w="http://schemas.openxmlformats.org/wordprocessingml/2006/main" xmlns:w14="http://schemas.microsoft.com/office/word/2010/wordml" xmlns:w15="http://schemas.microsoft.com/office/word/2012/wordml" xmlns:w16cex="http://schemas.microsoft.com/office/word/2018/wordml/cex" xmlns:w16cid="http://schemas.microsoft.com/office/word/2016/wordml/cid" xmlns:w16="http://schemas.microsoft.com/office/word/2018/wordml" xmlns:w16du="http://schemas.microsoft.com/office/word/2023/wordml/word16du" xmlns:w16sdtdh="http://schemas.microsoft.com/office/word/2020/wordml/sdtdatahash" xmlns:w16sdtfl="http://schemas.microsoft.com/office/word/2024/wordml/sdtformatlock" xmlns:w16se="http://schemas.microsoft.com/office/word/2015/wordml/symex" xmlns:wpg="http://schemas.microsoft.com/office/word/2010/wordprocessingGroup" xmlns:wpi="http://schemas.microsoft.com/office/word/2010/wordprocessingInk" xmlns:wne="http://schemas.microsoft.com/office/word/2006/wordml" xmlns:wps="http://schemas.microsoft.com/office/word/2010/wordprocessingShape" mc:Ignorable="w14 w15 w16se w16cid w16 w16cex w16sdtdh w16sdtfl w16du wp14">
+<w:endnotes xmlns:wpc="http://schemas.microsoft.com/office/word/2010/wordprocessingCanvas" xmlns:cx="http://schemas.microsoft.com/office/drawing/2014/chartex" xmlns:cx1="http://schemas.microsoft.com/office/drawing/2015/9/8/chartex" xmlns:cx2="http://schemas.microsoft.com/office/drawing/2015/10/21/chartex" xmlns:cx3="http://schemas.microsoft.com/office/drawing/2016/5/9/chartex" xmlns:cx4="http://schemas.microsoft.com/office/drawing/2016/5/10/chartex" xmlns:cx5="http://schemas.microsoft.com/office/drawing/2016/5/11/chartex" xmlns:cx6="http://schemas.microsoft.com/office/drawing/2016/5/12/chartex" xmlns:cx7="http://schemas.microsoft.com/office/drawing/2016/5/13/chartex" xmlns:cx8="http://schemas.microsoft.com/office/drawing/2016/5/14/chartex" xmlns:mc="http://schemas.openxmlformats.org/markup-compatibility/2006" xmlns:aink="http://schemas.microsoft.com/office/drawing/2016/ink" xmlns:am3d="http://schemas.microsoft.com/office/drawing/2017/model3d" xmlns:o="urn:schemas-microsoft-com:office:office" xmlns:r="http://schemas.openxmlformats.org/officeDocument/2006/relationships" xmlns:m="http://schemas.openxmlformats.org/officeDocument/2006/math" xmlns:v="urn:schemas-microsoft-com:vml" xmlns:wp14="http://schemas.microsoft.com/office/word/2010/wordprocessingDrawing" xmlns:wp="http://schemas.openxmlformats.org/drawingml/2006/wordprocessingDrawing" xmlns:w10="urn:schemas-microsoft-com:office:word" xmlns:w="http://schemas.openxmlformats.org/wordprocessingml/2006/main" xmlns:w14="http://schemas.microsoft.com/office/word/2010/wordml" xmlns:w15="http://schemas.microsoft.com/office/word/2012/wordml" xmlns:w16cex="http://schemas.microsoft.com/office/word/2018/wordml/cex" xmlns:w16cid="http://schemas.microsoft.com/office/word/2016/wordml/cid" xmlns:w16="http://schemas.microsoft.com/office/word/2018/wordml" xmlns:w16sdtdh="http://schemas.microsoft.com/office/word/2020/wordml/sdtdatahash" xmlns:w16se="http://schemas.microsoft.com/office/word/2015/wordml/symex" xmlns:wpg="http://schemas.microsoft.com/office/word/2010/wordprocessingGroup" xmlns:wpi="http://schemas.microsoft.com/office/word/2010/wordprocessingInk" xmlns:wne="http://schemas.microsoft.com/office/word/2006/wordml" xmlns:wps="http://schemas.microsoft.com/office/word/2010/wordprocessingShape" mc:Ignorable="w14 w15 w16se w16cid w16 w16cex w16sdtdh wp14">
   <w:endnote w:type="separator" w:id="-1">
     <w:p>
       <w:r>
@@ -11696,7 +11629,7 @@
 </file>
 
 <file path=word/footer1.xml><?xml version="1.0" encoding="utf-8"?>
-<w:ftr xmlns:wpc="http://schemas.microsoft.com/office/word/2010/wordprocessingCanvas" xmlns:cx="http://schemas.microsoft.com/office/drawing/2014/chartex" xmlns:cx1="http://schemas.microsoft.com/office/drawing/2015/9/8/chartex" xmlns:cx2="http://schemas.microsoft.com/office/drawing/2015/10/21/chartex" xmlns:cx3="http://schemas.microsoft.com/office/drawing/2016/5/9/chartex" xmlns:cx4="http://schemas.microsoft.com/office/drawing/2016/5/10/chartex" xmlns:cx5="http://schemas.microsoft.com/office/drawing/2016/5/11/chartex" xmlns:cx6="http://schemas.microsoft.com/office/drawing/2016/5/12/chartex" xmlns:cx7="http://schemas.microsoft.com/office/drawing/2016/5/13/chartex" xmlns:cx8="http://schemas.microsoft.com/office/drawing/2016/5/14/chartex" xmlns:mc="http://schemas.openxmlformats.org/markup-compatibility/2006" xmlns:aink="http://schemas.microsoft.com/office/drawing/2016/ink" xmlns:am3d="http://schemas.microsoft.com/office/drawing/2017/model3d" xmlns:o="urn:schemas-microsoft-com:office:office" xmlns:oel="http://schemas.microsoft.com/office/2019/extlst" xmlns:r="http://schemas.openxmlformats.org/officeDocument/2006/relationships" xmlns:m="http://schemas.openxmlformats.org/officeDocument/2006/math" xmlns:v="urn:schemas-microsoft-com:vml" xmlns:wp14="http://schemas.microsoft.com/office/word/2010/wordprocessingDrawing" xmlns:wp="http://schemas.openxmlformats.org/drawingml/2006/wordprocessingDrawing" xmlns:w10="urn:schemas-microsoft-com:office:word" xmlns:w="http://schemas.openxmlformats.org/wordprocessingml/2006/main" xmlns:w14="http://schemas.microsoft.com/office/word/2010/wordml" xmlns:w15="http://schemas.microsoft.com/office/word/2012/wordml" xmlns:w16cex="http://schemas.microsoft.com/office/word/2018/wordml/cex" xmlns:w16cid="http://schemas.microsoft.com/office/word/2016/wordml/cid" xmlns:w16="http://schemas.microsoft.com/office/word/2018/wordml" xmlns:w16du="http://schemas.microsoft.com/office/word/2023/wordml/word16du" xmlns:w16sdtdh="http://schemas.microsoft.com/office/word/2020/wordml/sdtdatahash" xmlns:w16sdtfl="http://schemas.microsoft.com/office/word/2024/wordml/sdtformatlock" xmlns:w16se="http://schemas.microsoft.com/office/word/2015/wordml/symex" xmlns:wpg="http://schemas.microsoft.com/office/word/2010/wordprocessingGroup" xmlns:wpi="http://schemas.microsoft.com/office/word/2010/wordprocessingInk" xmlns:wne="http://schemas.microsoft.com/office/word/2006/wordml" xmlns:wps="http://schemas.microsoft.com/office/word/2010/wordprocessingShape" mc:Ignorable="w14 w15 w16se w16cid w16 w16cex w16sdtdh w16sdtfl w16du wp14">
+<w:ftr xmlns:wpc="http://schemas.microsoft.com/office/word/2010/wordprocessingCanvas" xmlns:cx="http://schemas.microsoft.com/office/drawing/2014/chartex" xmlns:cx1="http://schemas.microsoft.com/office/drawing/2015/9/8/chartex" xmlns:cx2="http://schemas.microsoft.com/office/drawing/2015/10/21/chartex" xmlns:cx3="http://schemas.microsoft.com/office/drawing/2016/5/9/chartex" xmlns:cx4="http://schemas.microsoft.com/office/drawing/2016/5/10/chartex" xmlns:cx5="http://schemas.microsoft.com/office/drawing/2016/5/11/chartex" xmlns:cx6="http://schemas.microsoft.com/office/drawing/2016/5/12/chartex" xmlns:cx7="http://schemas.microsoft.com/office/drawing/2016/5/13/chartex" xmlns:cx8="http://schemas.microsoft.com/office/drawing/2016/5/14/chartex" xmlns:mc="http://schemas.openxmlformats.org/markup-compatibility/2006" xmlns:aink="http://schemas.microsoft.com/office/drawing/2016/ink" xmlns:am3d="http://schemas.microsoft.com/office/drawing/2017/model3d" xmlns:o="urn:schemas-microsoft-com:office:office" xmlns:r="http://schemas.openxmlformats.org/officeDocument/2006/relationships" xmlns:m="http://schemas.openxmlformats.org/officeDocument/2006/math" xmlns:v="urn:schemas-microsoft-com:vml" xmlns:wp14="http://schemas.microsoft.com/office/word/2010/wordprocessingDrawing" xmlns:wp="http://schemas.openxmlformats.org/drawingml/2006/wordprocessingDrawing" xmlns:w10="urn:schemas-microsoft-com:office:word" xmlns:w="http://schemas.openxmlformats.org/wordprocessingml/2006/main" xmlns:w14="http://schemas.microsoft.com/office/word/2010/wordml" xmlns:w15="http://schemas.microsoft.com/office/word/2012/wordml" xmlns:w16cex="http://schemas.microsoft.com/office/word/2018/wordml/cex" xmlns:w16cid="http://schemas.microsoft.com/office/word/2016/wordml/cid" xmlns:w16="http://schemas.microsoft.com/office/word/2018/wordml" xmlns:w16sdtdh="http://schemas.microsoft.com/office/word/2020/wordml/sdtdatahash" xmlns:w16se="http://schemas.microsoft.com/office/word/2015/wordml/symex" xmlns:wpg="http://schemas.microsoft.com/office/word/2010/wordprocessingGroup" xmlns:wpi="http://schemas.microsoft.com/office/word/2010/wordprocessingInk" xmlns:wne="http://schemas.microsoft.com/office/word/2006/wordml" xmlns:wps="http://schemas.microsoft.com/office/word/2010/wordprocessingShape" mc:Ignorable="w14 w15 w16se w16cid w16 w16cex w16sdtdh wp14">
   <w:p>
     <w:pPr>
       <w:pStyle w:val="a9"/>
@@ -11706,7 +11639,7 @@
 </file>
 
 <file path=word/footer2.xml><?xml version="1.0" encoding="utf-8"?>
-<w:ftr xmlns:wpc="http://schemas.microsoft.com/office/word/2010/wordprocessingCanvas" xmlns:cx="http://schemas.microsoft.com/office/drawing/2014/chartex" xmlns:cx1="http://schemas.microsoft.com/office/drawing/2015/9/8/chartex" xmlns:cx2="http://schemas.microsoft.com/office/drawing/2015/10/21/chartex" xmlns:cx3="http://schemas.microsoft.com/office/drawing/2016/5/9/chartex" xmlns:cx4="http://schemas.microsoft.com/office/drawing/2016/5/10/chartex" xmlns:cx5="http://schemas.microsoft.com/office/drawing/2016/5/11/chartex" xmlns:cx6="http://schemas.microsoft.com/office/drawing/2016/5/12/chartex" xmlns:cx7="http://schemas.microsoft.com/office/drawing/2016/5/13/chartex" xmlns:cx8="http://schemas.microsoft.com/office/drawing/2016/5/14/chartex" xmlns:mc="http://schemas.openxmlformats.org/markup-compatibility/2006" xmlns:aink="http://schemas.microsoft.com/office/drawing/2016/ink" xmlns:am3d="http://schemas.microsoft.com/office/drawing/2017/model3d" xmlns:o="urn:schemas-microsoft-com:office:office" xmlns:oel="http://schemas.microsoft.com/office/2019/extlst" xmlns:r="http://schemas.openxmlformats.org/officeDocument/2006/relationships" xmlns:m="http://schemas.openxmlformats.org/officeDocument/2006/math" xmlns:v="urn:schemas-microsoft-com:vml" xmlns:wp14="http://schemas.microsoft.com/office/word/2010/wordprocessingDrawing" xmlns:wp="http://schemas.openxmlformats.org/drawingml/2006/wordprocessingDrawing" xmlns:w10="urn:schemas-microsoft-com:office:word" xmlns:w="http://schemas.openxmlformats.org/wordprocessingml/2006/main" xmlns:w14="http://schemas.microsoft.com/office/word/2010/wordml" xmlns:w15="http://schemas.microsoft.com/office/word/2012/wordml" xmlns:w16cex="http://schemas.microsoft.com/office/word/2018/wordml/cex" xmlns:w16cid="http://schemas.microsoft.com/office/word/2016/wordml/cid" xmlns:w16="http://schemas.microsoft.com/office/word/2018/wordml" xmlns:w16du="http://schemas.microsoft.com/office/word/2023/wordml/word16du" xmlns:w16sdtdh="http://schemas.microsoft.com/office/word/2020/wordml/sdtdatahash" xmlns:w16sdtfl="http://schemas.microsoft.com/office/word/2024/wordml/sdtformatlock" xmlns:w16se="http://schemas.microsoft.com/office/word/2015/wordml/symex" xmlns:wpg="http://schemas.microsoft.com/office/word/2010/wordprocessingGroup" xmlns:wpi="http://schemas.microsoft.com/office/word/2010/wordprocessingInk" xmlns:wne="http://schemas.microsoft.com/office/word/2006/wordml" xmlns:wps="http://schemas.microsoft.com/office/word/2010/wordprocessingShape" mc:Ignorable="w14 w15 w16se w16cid w16 w16cex w16sdtdh w16sdtfl w16du wp14">
+<w:ftr xmlns:wpc="http://schemas.microsoft.com/office/word/2010/wordprocessingCanvas" xmlns:cx="http://schemas.microsoft.com/office/drawing/2014/chartex" xmlns:cx1="http://schemas.microsoft.com/office/drawing/2015/9/8/chartex" xmlns:cx2="http://schemas.microsoft.com/office/drawing/2015/10/21/chartex" xmlns:cx3="http://schemas.microsoft.com/office/drawing/2016/5/9/chartex" xmlns:cx4="http://schemas.microsoft.com/office/drawing/2016/5/10/chartex" xmlns:cx5="http://schemas.microsoft.com/office/drawing/2016/5/11/chartex" xmlns:cx6="http://schemas.microsoft.com/office/drawing/2016/5/12/chartex" xmlns:cx7="http://schemas.microsoft.com/office/drawing/2016/5/13/chartex" xmlns:cx8="http://schemas.microsoft.com/office/drawing/2016/5/14/chartex" xmlns:mc="http://schemas.openxmlformats.org/markup-compatibility/2006" xmlns:aink="http://schemas.microsoft.com/office/drawing/2016/ink" xmlns:am3d="http://schemas.microsoft.com/office/drawing/2017/model3d" xmlns:o="urn:schemas-microsoft-com:office:office" xmlns:r="http://schemas.openxmlformats.org/officeDocument/2006/relationships" xmlns:m="http://schemas.openxmlformats.org/officeDocument/2006/math" xmlns:v="urn:schemas-microsoft-com:vml" xmlns:wp14="http://schemas.microsoft.com/office/word/2010/wordprocessingDrawing" xmlns:wp="http://schemas.openxmlformats.org/drawingml/2006/wordprocessingDrawing" xmlns:w10="urn:schemas-microsoft-com:office:word" xmlns:w="http://schemas.openxmlformats.org/wordprocessingml/2006/main" xmlns:w14="http://schemas.microsoft.com/office/word/2010/wordml" xmlns:w15="http://schemas.microsoft.com/office/word/2012/wordml" xmlns:w16cex="http://schemas.microsoft.com/office/word/2018/wordml/cex" xmlns:w16cid="http://schemas.microsoft.com/office/word/2016/wordml/cid" xmlns:w16="http://schemas.microsoft.com/office/word/2018/wordml" xmlns:w16sdtdh="http://schemas.microsoft.com/office/word/2020/wordml/sdtdatahash" xmlns:w16se="http://schemas.microsoft.com/office/word/2015/wordml/symex" xmlns:wpg="http://schemas.microsoft.com/office/word/2010/wordprocessingGroup" xmlns:wpi="http://schemas.microsoft.com/office/word/2010/wordprocessingInk" xmlns:wne="http://schemas.microsoft.com/office/word/2006/wordml" xmlns:wps="http://schemas.microsoft.com/office/word/2010/wordprocessingShape" mc:Ignorable="w14 w15 w16se w16cid w16 w16cex w16sdtdh wp14">
   <w:p>
     <w:pPr>
       <w:pStyle w:val="a9"/>
@@ -11716,7 +11649,7 @@
 </file>
 
 <file path=word/footer3.xml><?xml version="1.0" encoding="utf-8"?>
-<w:ftr xmlns:wpc="http://schemas.microsoft.com/office/word/2010/wordprocessingCanvas" xmlns:cx="http://schemas.microsoft.com/office/drawing/2014/chartex" xmlns:cx1="http://schemas.microsoft.com/office/drawing/2015/9/8/chartex" xmlns:cx2="http://schemas.microsoft.com/office/drawing/2015/10/21/chartex" xmlns:cx3="http://schemas.microsoft.com/office/drawing/2016/5/9/chartex" xmlns:cx4="http://schemas.microsoft.com/office/drawing/2016/5/10/chartex" xmlns:cx5="http://schemas.microsoft.com/office/drawing/2016/5/11/chartex" xmlns:cx6="http://schemas.microsoft.com/office/drawing/2016/5/12/chartex" xmlns:cx7="http://schemas.microsoft.com/office/drawing/2016/5/13/chartex" xmlns:cx8="http://schemas.microsoft.com/office/drawing/2016/5/14/chartex" xmlns:mc="http://schemas.openxmlformats.org/markup-compatibility/2006" xmlns:aink="http://schemas.microsoft.com/office/drawing/2016/ink" xmlns:am3d="http://schemas.microsoft.com/office/drawing/2017/model3d" xmlns:o="urn:schemas-microsoft-com:office:office" xmlns:oel="http://schemas.microsoft.com/office/2019/extlst" xmlns:r="http://schemas.openxmlformats.org/officeDocument/2006/relationships" xmlns:m="http://schemas.openxmlformats.org/officeDocument/2006/math" xmlns:v="urn:schemas-microsoft-com:vml" xmlns:wp14="http://schemas.microsoft.com/office/word/2010/wordprocessingDrawing" xmlns:wp="http://schemas.openxmlformats.org/drawingml/2006/wordprocessingDrawing" xmlns:w10="urn:schemas-microsoft-com:office:word" xmlns:w="http://schemas.openxmlformats.org/wordprocessingml/2006/main" xmlns:w14="http://schemas.microsoft.com/office/word/2010/wordml" xmlns:w15="http://schemas.microsoft.com/office/word/2012/wordml" xmlns:w16cex="http://schemas.microsoft.com/office/word/2018/wordml/cex" xmlns:w16cid="http://schemas.microsoft.com/office/word/2016/wordml/cid" xmlns:w16="http://schemas.microsoft.com/office/word/2018/wordml" xmlns:w16du="http://schemas.microsoft.com/office/word/2023/wordml/word16du" xmlns:w16sdtdh="http://schemas.microsoft.com/office/word/2020/wordml/sdtdatahash" xmlns:w16sdtfl="http://schemas.microsoft.com/office/word/2024/wordml/sdtformatlock" xmlns:w16se="http://schemas.microsoft.com/office/word/2015/wordml/symex" xmlns:wpg="http://schemas.microsoft.com/office/word/2010/wordprocessingGroup" xmlns:wpi="http://schemas.microsoft.com/office/word/2010/wordprocessingInk" xmlns:wne="http://schemas.microsoft.com/office/word/2006/wordml" xmlns:wps="http://schemas.microsoft.com/office/word/2010/wordprocessingShape" mc:Ignorable="w14 w15 w16se w16cid w16 w16cex w16sdtdh w16sdtfl w16du wp14">
+<w:ftr xmlns:wpc="http://schemas.microsoft.com/office/word/2010/wordprocessingCanvas" xmlns:cx="http://schemas.microsoft.com/office/drawing/2014/chartex" xmlns:cx1="http://schemas.microsoft.com/office/drawing/2015/9/8/chartex" xmlns:cx2="http://schemas.microsoft.com/office/drawing/2015/10/21/chartex" xmlns:cx3="http://schemas.microsoft.com/office/drawing/2016/5/9/chartex" xmlns:cx4="http://schemas.microsoft.com/office/drawing/2016/5/10/chartex" xmlns:cx5="http://schemas.microsoft.com/office/drawing/2016/5/11/chartex" xmlns:cx6="http://schemas.microsoft.com/office/drawing/2016/5/12/chartex" xmlns:cx7="http://schemas.microsoft.com/office/drawing/2016/5/13/chartex" xmlns:cx8="http://schemas.microsoft.com/office/drawing/2016/5/14/chartex" xmlns:mc="http://schemas.openxmlformats.org/markup-compatibility/2006" xmlns:aink="http://schemas.microsoft.com/office/drawing/2016/ink" xmlns:am3d="http://schemas.microsoft.com/office/drawing/2017/model3d" xmlns:o="urn:schemas-microsoft-com:office:office" xmlns:r="http://schemas.openxmlformats.org/officeDocument/2006/relationships" xmlns:m="http://schemas.openxmlformats.org/officeDocument/2006/math" xmlns:v="urn:schemas-microsoft-com:vml" xmlns:wp14="http://schemas.microsoft.com/office/word/2010/wordprocessingDrawing" xmlns:wp="http://schemas.openxmlformats.org/drawingml/2006/wordprocessingDrawing" xmlns:w10="urn:schemas-microsoft-com:office:word" xmlns:w="http://schemas.openxmlformats.org/wordprocessingml/2006/main" xmlns:w14="http://schemas.microsoft.com/office/word/2010/wordml" xmlns:w15="http://schemas.microsoft.com/office/word/2012/wordml" xmlns:w16cex="http://schemas.microsoft.com/office/word/2018/wordml/cex" xmlns:w16cid="http://schemas.microsoft.com/office/word/2016/wordml/cid" xmlns:w16="http://schemas.microsoft.com/office/word/2018/wordml" xmlns:w16sdtdh="http://schemas.microsoft.com/office/word/2020/wordml/sdtdatahash" xmlns:w16se="http://schemas.microsoft.com/office/word/2015/wordml/symex" xmlns:wpg="http://schemas.microsoft.com/office/word/2010/wordprocessingGroup" xmlns:wpi="http://schemas.microsoft.com/office/word/2010/wordprocessingInk" xmlns:wne="http://schemas.microsoft.com/office/word/2006/wordml" xmlns:wps="http://schemas.microsoft.com/office/word/2010/wordprocessingShape" mc:Ignorable="w14 w15 w16se w16cid w16 w16cex w16sdtdh wp14">
   <w:p>
     <w:pPr>
       <w:pStyle w:val="a9"/>
@@ -11726,7 +11659,7 @@
 </file>
 
 <file path=word/footnotes.xml><?xml version="1.0" encoding="utf-8"?>
-<w:footnotes xmlns:wpc="http://schemas.microsoft.com/office/word/2010/wordprocessingCanvas" xmlns:cx="http://schemas.microsoft.com/office/drawing/2014/chartex" xmlns:cx1="http://schemas.microsoft.com/office/drawing/2015/9/8/chartex" xmlns:cx2="http://schemas.microsoft.com/office/drawing/2015/10/21/chartex" xmlns:cx3="http://schemas.microsoft.com/office/drawing/2016/5/9/chartex" xmlns:cx4="http://schemas.microsoft.com/office/drawing/2016/5/10/chartex" xmlns:cx5="http://schemas.microsoft.com/office/drawing/2016/5/11/chartex" xmlns:cx6="http://schemas.microsoft.com/office/drawing/2016/5/12/chartex" xmlns:cx7="http://schemas.microsoft.com/office/drawing/2016/5/13/chartex" xmlns:cx8="http://schemas.microsoft.com/office/drawing/2016/5/14/chartex" xmlns:mc="http://schemas.openxmlformats.org/markup-compatibility/2006" xmlns:aink="http://schemas.microsoft.com/office/drawing/2016/ink" xmlns:am3d="http://schemas.microsoft.com/office/drawing/2017/model3d" xmlns:o="urn:schemas-microsoft-com:office:office" xmlns:oel="http://schemas.microsoft.com/office/2019/extlst" xmlns:r="http://schemas.openxmlformats.org/officeDocument/2006/relationships" xmlns:m="http://schemas.openxmlformats.org/officeDocument/2006/math" xmlns:v="urn:schemas-microsoft-com:vml" xmlns:wp14="http://schemas.microsoft.com/office/word/2010/wordprocessingDrawing" xmlns:wp="http://schemas.openxmlformats.org/drawingml/2006/wordprocessingDrawing" xmlns:w10="urn:schemas-microsoft-com:office:word" xmlns:w="http://schemas.openxmlformats.org/wordprocessingml/2006/main" xmlns:w14="http://schemas.microsoft.com/office/word/2010/wordml" xmlns:w15="http://schemas.microsoft.com/office/word/2012/wordml" xmlns:w16cex="http://schemas.microsoft.com/office/word/2018/wordml/cex" xmlns:w16cid="http://schemas.microsoft.com/office/word/2016/wordml/cid" xmlns:w16="http://schemas.microsoft.com/office/word/2018/wordml" xmlns:w16du="http://schemas.microsoft.com/office/word/2023/wordml/word16du" xmlns:w16sdtdh="http://schemas.microsoft.com/office/word/2020/wordml/sdtdatahash" xmlns:w16sdtfl="http://schemas.microsoft.com/office/word/2024/wordml/sdtformatlock" xmlns:w16se="http://schemas.microsoft.com/office/word/2015/wordml/symex" xmlns:wpg="http://schemas.microsoft.com/office/word/2010/wordprocessingGroup" xmlns:wpi="http://schemas.microsoft.com/office/word/2010/wordprocessingInk" xmlns:wne="http://schemas.microsoft.com/office/word/2006/wordml" xmlns:wps="http://schemas.microsoft.com/office/word/2010/wordprocessingShape" mc:Ignorable="w14 w15 w16se w16cid w16 w16cex w16sdtdh w16sdtfl w16du wp14">
+<w:footnotes xmlns:wpc="http://schemas.microsoft.com/office/word/2010/wordprocessingCanvas" xmlns:cx="http://schemas.microsoft.com/office/drawing/2014/chartex" xmlns:cx1="http://schemas.microsoft.com/office/drawing/2015/9/8/chartex" xmlns:cx2="http://schemas.microsoft.com/office/drawing/2015/10/21/chartex" xmlns:cx3="http://schemas.microsoft.com/office/drawing/2016/5/9/chartex" xmlns:cx4="http://schemas.microsoft.com/office/drawing/2016/5/10/chartex" xmlns:cx5="http://schemas.microsoft.com/office/drawing/2016/5/11/chartex" xmlns:cx6="http://schemas.microsoft.com/office/drawing/2016/5/12/chartex" xmlns:cx7="http://schemas.microsoft.com/office/drawing/2016/5/13/chartex" xmlns:cx8="http://schemas.microsoft.com/office/drawing/2016/5/14/chartex" xmlns:mc="http://schemas.openxmlformats.org/markup-compatibility/2006" xmlns:aink="http://schemas.microsoft.com/office/drawing/2016/ink" xmlns:am3d="http://schemas.microsoft.com/office/drawing/2017/model3d" xmlns:o="urn:schemas-microsoft-com:office:office" xmlns:r="http://schemas.openxmlformats.org/officeDocument/2006/relationships" xmlns:m="http://schemas.openxmlformats.org/officeDocument/2006/math" xmlns:v="urn:schemas-microsoft-com:vml" xmlns:wp14="http://schemas.microsoft.com/office/word/2010/wordprocessingDrawing" xmlns:wp="http://schemas.openxmlformats.org/drawingml/2006/wordprocessingDrawing" xmlns:w10="urn:schemas-microsoft-com:office:word" xmlns:w="http://schemas.openxmlformats.org/wordprocessingml/2006/main" xmlns:w14="http://schemas.microsoft.com/office/word/2010/wordml" xmlns:w15="http://schemas.microsoft.com/office/word/2012/wordml" xmlns:w16cex="http://schemas.microsoft.com/office/word/2018/wordml/cex" xmlns:w16cid="http://schemas.microsoft.com/office/word/2016/wordml/cid" xmlns:w16="http://schemas.microsoft.com/office/word/2018/wordml" xmlns:w16sdtdh="http://schemas.microsoft.com/office/word/2020/wordml/sdtdatahash" xmlns:w16se="http://schemas.microsoft.com/office/word/2015/wordml/symex" xmlns:wpg="http://schemas.microsoft.com/office/word/2010/wordprocessingGroup" xmlns:wpi="http://schemas.microsoft.com/office/word/2010/wordprocessingInk" xmlns:wne="http://schemas.microsoft.com/office/word/2006/wordml" xmlns:wps="http://schemas.microsoft.com/office/word/2010/wordprocessingShape" mc:Ignorable="w14 w15 w16se w16cid w16 w16cex w16sdtdh wp14">
   <w:footnote w:type="separator" w:id="-1">
     <w:p>
       <w:r>
@@ -11745,7 +11678,7 @@
 </file>
 
 <file path=word/header1.xml><?xml version="1.0" encoding="utf-8"?>
-<w:hdr xmlns:wpc="http://schemas.microsoft.com/office/word/2010/wordprocessingCanvas" xmlns:cx="http://schemas.microsoft.com/office/drawing/2014/chartex" xmlns:cx1="http://schemas.microsoft.com/office/drawing/2015/9/8/chartex" xmlns:cx2="http://schemas.microsoft.com/office/drawing/2015/10/21/chartex" xmlns:cx3="http://schemas.microsoft.com/office/drawing/2016/5/9/chartex" xmlns:cx4="http://schemas.microsoft.com/office/drawing/2016/5/10/chartex" xmlns:cx5="http://schemas.microsoft.com/office/drawing/2016/5/11/chartex" xmlns:cx6="http://schemas.microsoft.com/office/drawing/2016/5/12/chartex" xmlns:cx7="http://schemas.microsoft.com/office/drawing/2016/5/13/chartex" xmlns:cx8="http://schemas.microsoft.com/office/drawing/2016/5/14/chartex" xmlns:mc="http://schemas.openxmlformats.org/markup-compatibility/2006" xmlns:aink="http://schemas.microsoft.com/office/drawing/2016/ink" xmlns:am3d="http://schemas.microsoft.com/office/drawing/2017/model3d" xmlns:o="urn:schemas-microsoft-com:office:office" xmlns:oel="http://schemas.microsoft.com/office/2019/extlst" xmlns:r="http://schemas.openxmlformats.org/officeDocument/2006/relationships" xmlns:m="http://schemas.openxmlformats.org/officeDocument/2006/math" xmlns:v="urn:schemas-microsoft-com:vml" xmlns:wp14="http://schemas.microsoft.com/office/word/2010/wordprocessingDrawing" xmlns:wp="http://schemas.openxmlformats.org/drawingml/2006/wordprocessingDrawing" xmlns:w10="urn:schemas-microsoft-com:office:word" xmlns:w="http://schemas.openxmlformats.org/wordprocessingml/2006/main" xmlns:w14="http://schemas.microsoft.com/office/word/2010/wordml" xmlns:w15="http://schemas.microsoft.com/office/word/2012/wordml" xmlns:w16cex="http://schemas.microsoft.com/office/word/2018/wordml/cex" xmlns:w16cid="http://schemas.microsoft.com/office/word/2016/wordml/cid" xmlns:w16="http://schemas.microsoft.com/office/word/2018/wordml" xmlns:w16du="http://schemas.microsoft.com/office/word/2023/wordml/word16du" xmlns:w16sdtdh="http://schemas.microsoft.com/office/word/2020/wordml/sdtdatahash" xmlns:w16sdtfl="http://schemas.microsoft.com/office/word/2024/wordml/sdtformatlock" xmlns:w16se="http://schemas.microsoft.com/office/word/2015/wordml/symex" xmlns:wpg="http://schemas.microsoft.com/office/word/2010/wordprocessingGroup" xmlns:wpi="http://schemas.microsoft.com/office/word/2010/wordprocessingInk" xmlns:wne="http://schemas.microsoft.com/office/word/2006/wordml" xmlns:wps="http://schemas.microsoft.com/office/word/2010/wordprocessingShape" mc:Ignorable="w14 w15 w16se w16cid w16 w16cex w16sdtdh w16sdtfl w16du wp14">
+<w:hdr xmlns:wpc="http://schemas.microsoft.com/office/word/2010/wordprocessingCanvas" xmlns:cx="http://schemas.microsoft.com/office/drawing/2014/chartex" xmlns:cx1="http://schemas.microsoft.com/office/drawing/2015/9/8/chartex" xmlns:cx2="http://schemas.microsoft.com/office/drawing/2015/10/21/chartex" xmlns:cx3="http://schemas.microsoft.com/office/drawing/2016/5/9/chartex" xmlns:cx4="http://schemas.microsoft.com/office/drawing/2016/5/10/chartex" xmlns:cx5="http://schemas.microsoft.com/office/drawing/2016/5/11/chartex" xmlns:cx6="http://schemas.microsoft.com/office/drawing/2016/5/12/chartex" xmlns:cx7="http://schemas.microsoft.com/office/drawing/2016/5/13/chartex" xmlns:cx8="http://schemas.microsoft.com/office/drawing/2016/5/14/chartex" xmlns:mc="http://schemas.openxmlformats.org/markup-compatibility/2006" xmlns:aink="http://schemas.microsoft.com/office/drawing/2016/ink" xmlns:am3d="http://schemas.microsoft.com/office/drawing/2017/model3d" xmlns:o="urn:schemas-microsoft-com:office:office" xmlns:r="http://schemas.openxmlformats.org/officeDocument/2006/relationships" xmlns:m="http://schemas.openxmlformats.org/officeDocument/2006/math" xmlns:v="urn:schemas-microsoft-com:vml" xmlns:wp14="http://schemas.microsoft.com/office/word/2010/wordprocessingDrawing" xmlns:wp="http://schemas.openxmlformats.org/drawingml/2006/wordprocessingDrawing" xmlns:w10="urn:schemas-microsoft-com:office:word" xmlns:w="http://schemas.openxmlformats.org/wordprocessingml/2006/main" xmlns:w14="http://schemas.microsoft.com/office/word/2010/wordml" xmlns:w15="http://schemas.microsoft.com/office/word/2012/wordml" xmlns:w16cex="http://schemas.microsoft.com/office/word/2018/wordml/cex" xmlns:w16cid="http://schemas.microsoft.com/office/word/2016/wordml/cid" xmlns:w16="http://schemas.microsoft.com/office/word/2018/wordml" xmlns:w16sdtdh="http://schemas.microsoft.com/office/word/2020/wordml/sdtdatahash" xmlns:w16se="http://schemas.microsoft.com/office/word/2015/wordml/symex" xmlns:wpg="http://schemas.microsoft.com/office/word/2010/wordprocessingGroup" xmlns:wpi="http://schemas.microsoft.com/office/word/2010/wordprocessingInk" xmlns:wne="http://schemas.microsoft.com/office/word/2006/wordml" xmlns:wps="http://schemas.microsoft.com/office/word/2010/wordprocessingShape" mc:Ignorable="w14 w15 w16se w16cid w16 w16cex w16sdtdh wp14">
   <w:p>
     <w:pPr>
       <w:pStyle w:val="a7"/>
@@ -11755,7 +11688,7 @@
 </file>
 
 <file path=word/header2.xml><?xml version="1.0" encoding="utf-8"?>
-<w:hdr xmlns:wpc="http://schemas.microsoft.com/office/word/2010/wordprocessingCanvas" xmlns:cx="http://schemas.microsoft.com/office/drawing/2014/chartex" xmlns:cx1="http://schemas.microsoft.com/office/drawing/2015/9/8/chartex" xmlns:cx2="http://schemas.microsoft.com/office/drawing/2015/10/21/chartex" xmlns:cx3="http://schemas.microsoft.com/office/drawing/2016/5/9/chartex" xmlns:cx4="http://schemas.microsoft.com/office/drawing/2016/5/10/chartex" xmlns:cx5="http://schemas.microsoft.com/office/drawing/2016/5/11/chartex" xmlns:cx6="http://schemas.microsoft.com/office/drawing/2016/5/12/chartex" xmlns:cx7="http://schemas.microsoft.com/office/drawing/2016/5/13/chartex" xmlns:cx8="http://schemas.microsoft.com/office/drawing/2016/5/14/chartex" xmlns:mc="http://schemas.openxmlformats.org/markup-compatibility/2006" xmlns:aink="http://schemas.microsoft.com/office/drawing/2016/ink" xmlns:am3d="http://schemas.microsoft.com/office/drawing/2017/model3d" xmlns:o="urn:schemas-microsoft-com:office:office" xmlns:oel="http://schemas.microsoft.com/office/2019/extlst" xmlns:r="http://schemas.openxmlformats.org/officeDocument/2006/relationships" xmlns:m="http://schemas.openxmlformats.org/officeDocument/2006/math" xmlns:v="urn:schemas-microsoft-com:vml" xmlns:wp14="http://schemas.microsoft.com/office/word/2010/wordprocessingDrawing" xmlns:wp="http://schemas.openxmlformats.org/drawingml/2006/wordprocessingDrawing" xmlns:w10="urn:schemas-microsoft-com:office:word" xmlns:w="http://schemas.openxmlformats.org/wordprocessingml/2006/main" xmlns:w14="http://schemas.microsoft.com/office/word/2010/wordml" xmlns:w15="http://schemas.microsoft.com/office/word/2012/wordml" xmlns:w16cex="http://schemas.microsoft.com/office/word/2018/wordml/cex" xmlns:w16cid="http://schemas.microsoft.com/office/word/2016/wordml/cid" xmlns:w16="http://schemas.microsoft.com/office/word/2018/wordml" xmlns:w16du="http://schemas.microsoft.com/office/word/2023/wordml/word16du" xmlns:w16sdtdh="http://schemas.microsoft.com/office/word/2020/wordml/sdtdatahash" xmlns:w16sdtfl="http://schemas.microsoft.com/office/word/2024/wordml/sdtformatlock" xmlns:w16se="http://schemas.microsoft.com/office/word/2015/wordml/symex" xmlns:wpg="http://schemas.microsoft.com/office/word/2010/wordprocessingGroup" xmlns:wpi="http://schemas.microsoft.com/office/word/2010/wordprocessingInk" xmlns:wne="http://schemas.microsoft.com/office/word/2006/wordml" xmlns:wps="http://schemas.microsoft.com/office/word/2010/wordprocessingShape" mc:Ignorable="w14 w15 w16se w16cid w16 w16cex w16sdtdh w16sdtfl w16du wp14">
+<w:hdr xmlns:wpc="http://schemas.microsoft.com/office/word/2010/wordprocessingCanvas" xmlns:cx="http://schemas.microsoft.com/office/drawing/2014/chartex" xmlns:cx1="http://schemas.microsoft.com/office/drawing/2015/9/8/chartex" xmlns:cx2="http://schemas.microsoft.com/office/drawing/2015/10/21/chartex" xmlns:cx3="http://schemas.microsoft.com/office/drawing/2016/5/9/chartex" xmlns:cx4="http://schemas.microsoft.com/office/drawing/2016/5/10/chartex" xmlns:cx5="http://schemas.microsoft.com/office/drawing/2016/5/11/chartex" xmlns:cx6="http://schemas.microsoft.com/office/drawing/2016/5/12/chartex" xmlns:cx7="http://schemas.microsoft.com/office/drawing/2016/5/13/chartex" xmlns:cx8="http://schemas.microsoft.com/office/drawing/2016/5/14/chartex" xmlns:mc="http://schemas.openxmlformats.org/markup-compatibility/2006" xmlns:aink="http://schemas.microsoft.com/office/drawing/2016/ink" xmlns:am3d="http://schemas.microsoft.com/office/drawing/2017/model3d" xmlns:o="urn:schemas-microsoft-com:office:office" xmlns:r="http://schemas.openxmlformats.org/officeDocument/2006/relationships" xmlns:m="http://schemas.openxmlformats.org/officeDocument/2006/math" xmlns:v="urn:schemas-microsoft-com:vml" xmlns:wp14="http://schemas.microsoft.com/office/word/2010/wordprocessingDrawing" xmlns:wp="http://schemas.openxmlformats.org/drawingml/2006/wordprocessingDrawing" xmlns:w10="urn:schemas-microsoft-com:office:word" xmlns:w="http://schemas.openxmlformats.org/wordprocessingml/2006/main" xmlns:w14="http://schemas.microsoft.com/office/word/2010/wordml" xmlns:w15="http://schemas.microsoft.com/office/word/2012/wordml" xmlns:w16cex="http://schemas.microsoft.com/office/word/2018/wordml/cex" xmlns:w16cid="http://schemas.microsoft.com/office/word/2016/wordml/cid" xmlns:w16="http://schemas.microsoft.com/office/word/2018/wordml" xmlns:w16sdtdh="http://schemas.microsoft.com/office/word/2020/wordml/sdtdatahash" xmlns:w16se="http://schemas.microsoft.com/office/word/2015/wordml/symex" xmlns:wpg="http://schemas.microsoft.com/office/word/2010/wordprocessingGroup" xmlns:wpi="http://schemas.microsoft.com/office/word/2010/wordprocessingInk" xmlns:wne="http://schemas.microsoft.com/office/word/2006/wordml" xmlns:wps="http://schemas.microsoft.com/office/word/2010/wordprocessingShape" mc:Ignorable="w14 w15 w16se w16cid w16 w16cex w16sdtdh wp14">
   <w:p>
     <w:pPr>
       <w:pStyle w:val="a7"/>
@@ -11765,7 +11698,7 @@
 </file>
 
 <file path=word/header3.xml><?xml version="1.0" encoding="utf-8"?>
-<w:hdr xmlns:wpc="http://schemas.microsoft.com/office/word/2010/wordprocessingCanvas" xmlns:cx="http://schemas.microsoft.com/office/drawing/2014/chartex" xmlns:cx1="http://schemas.microsoft.com/office/drawing/2015/9/8/chartex" xmlns:cx2="http://schemas.microsoft.com/office/drawing/2015/10/21/chartex" xmlns:cx3="http://schemas.microsoft.com/office/drawing/2016/5/9/chartex" xmlns:cx4="http://schemas.microsoft.com/office/drawing/2016/5/10/chartex" xmlns:cx5="http://schemas.microsoft.com/office/drawing/2016/5/11/chartex" xmlns:cx6="http://schemas.microsoft.com/office/drawing/2016/5/12/chartex" xmlns:cx7="http://schemas.microsoft.com/office/drawing/2016/5/13/chartex" xmlns:cx8="http://schemas.microsoft.com/office/drawing/2016/5/14/chartex" xmlns:mc="http://schemas.openxmlformats.org/markup-compatibility/2006" xmlns:aink="http://schemas.microsoft.com/office/drawing/2016/ink" xmlns:am3d="http://schemas.microsoft.com/office/drawing/2017/model3d" xmlns:o="urn:schemas-microsoft-com:office:office" xmlns:oel="http://schemas.microsoft.com/office/2019/extlst" xmlns:r="http://schemas.openxmlformats.org/officeDocument/2006/relationships" xmlns:m="http://schemas.openxmlformats.org/officeDocument/2006/math" xmlns:v="urn:schemas-microsoft-com:vml" xmlns:wp14="http://schemas.microsoft.com/office/word/2010/wordprocessingDrawing" xmlns:wp="http://schemas.openxmlformats.org/drawingml/2006/wordprocessingDrawing" xmlns:w10="urn:schemas-microsoft-com:office:word" xmlns:w="http://schemas.openxmlformats.org/wordprocessingml/2006/main" xmlns:w14="http://schemas.microsoft.com/office/word/2010/wordml" xmlns:w15="http://schemas.microsoft.com/office/word/2012/wordml" xmlns:w16cex="http://schemas.microsoft.com/office/word/2018/wordml/cex" xmlns:w16cid="http://schemas.microsoft.com/office/word/2016/wordml/cid" xmlns:w16="http://schemas.microsoft.com/office/word/2018/wordml" xmlns:w16du="http://schemas.microsoft.com/office/word/2023/wordml/word16du" xmlns:w16sdtdh="http://schemas.microsoft.com/office/word/2020/wordml/sdtdatahash" xmlns:w16sdtfl="http://schemas.microsoft.com/office/word/2024/wordml/sdtformatlock" xmlns:w16se="http://schemas.microsoft.com/office/word/2015/wordml/symex" xmlns:wpg="http://schemas.microsoft.com/office/word/2010/wordprocessingGroup" xmlns:wpi="http://schemas.microsoft.com/office/word/2010/wordprocessingInk" xmlns:wne="http://schemas.microsoft.com/office/word/2006/wordml" xmlns:wps="http://schemas.microsoft.com/office/word/2010/wordprocessingShape" mc:Ignorable="w14 w15 w16se w16cid w16 w16cex w16sdtdh w16sdtfl w16du wp14">
+<w:hdr xmlns:wpc="http://schemas.microsoft.com/office/word/2010/wordprocessingCanvas" xmlns:cx="http://schemas.microsoft.com/office/drawing/2014/chartex" xmlns:cx1="http://schemas.microsoft.com/office/drawing/2015/9/8/chartex" xmlns:cx2="http://schemas.microsoft.com/office/drawing/2015/10/21/chartex" xmlns:cx3="http://schemas.microsoft.com/office/drawing/2016/5/9/chartex" xmlns:cx4="http://schemas.microsoft.com/office/drawing/2016/5/10/chartex" xmlns:cx5="http://schemas.microsoft.com/office/drawing/2016/5/11/chartex" xmlns:cx6="http://schemas.microsoft.com/office/drawing/2016/5/12/chartex" xmlns:cx7="http://schemas.microsoft.com/office/drawing/2016/5/13/chartex" xmlns:cx8="http://schemas.microsoft.com/office/drawing/2016/5/14/chartex" xmlns:mc="http://schemas.openxmlformats.org/markup-compatibility/2006" xmlns:aink="http://schemas.microsoft.com/office/drawing/2016/ink" xmlns:am3d="http://schemas.microsoft.com/office/drawing/2017/model3d" xmlns:o="urn:schemas-microsoft-com:office:office" xmlns:r="http://schemas.openxmlformats.org/officeDocument/2006/relationships" xmlns:m="http://schemas.openxmlformats.org/officeDocument/2006/math" xmlns:v="urn:schemas-microsoft-com:vml" xmlns:wp14="http://schemas.microsoft.com/office/word/2010/wordprocessingDrawing" xmlns:wp="http://schemas.openxmlformats.org/drawingml/2006/wordprocessingDrawing" xmlns:w10="urn:schemas-microsoft-com:office:word" xmlns:w="http://schemas.openxmlformats.org/wordprocessingml/2006/main" xmlns:w14="http://schemas.microsoft.com/office/word/2010/wordml" xmlns:w15="http://schemas.microsoft.com/office/word/2012/wordml" xmlns:w16cex="http://schemas.microsoft.com/office/word/2018/wordml/cex" xmlns:w16cid="http://schemas.microsoft.com/office/word/2016/wordml/cid" xmlns:w16="http://schemas.microsoft.com/office/word/2018/wordml" xmlns:w16sdtdh="http://schemas.microsoft.com/office/word/2020/wordml/sdtdatahash" xmlns:w16se="http://schemas.microsoft.com/office/word/2015/wordml/symex" xmlns:wpg="http://schemas.microsoft.com/office/word/2010/wordprocessingGroup" xmlns:wpi="http://schemas.microsoft.com/office/word/2010/wordprocessingInk" xmlns:wne="http://schemas.microsoft.com/office/word/2006/wordml" xmlns:wps="http://schemas.microsoft.com/office/word/2010/wordprocessingShape" mc:Ignorable="w14 w15 w16se w16cid w16 w16cex w16sdtdh wp14">
   <w:p>
     <w:pPr>
       <w:pStyle w:val="a7"/>
@@ -11775,7 +11708,7 @@
 </file>
 
 <file path=word/numbering.xml><?xml version="1.0" encoding="utf-8"?>
-<w:numbering xmlns:wpc="http://schemas.microsoft.com/office/word/2010/wordprocessingCanvas" xmlns:cx="http://schemas.microsoft.com/office/drawing/2014/chartex" xmlns:cx1="http://schemas.microsoft.com/office/drawing/2015/9/8/chartex" xmlns:cx2="http://schemas.microsoft.com/office/drawing/2015/10/21/chartex" xmlns:cx3="http://schemas.microsoft.com/office/drawing/2016/5/9/chartex" xmlns:cx4="http://schemas.microsoft.com/office/drawing/2016/5/10/chartex" xmlns:cx5="http://schemas.microsoft.com/office/drawing/2016/5/11/chartex" xmlns:cx6="http://schemas.microsoft.com/office/drawing/2016/5/12/chartex" xmlns:cx7="http://schemas.microsoft.com/office/drawing/2016/5/13/chartex" xmlns:cx8="http://schemas.microsoft.com/office/drawing/2016/5/14/chartex" xmlns:mc="http://schemas.openxmlformats.org/markup-compatibility/2006" xmlns:aink="http://schemas.microsoft.com/office/drawing/2016/ink" xmlns:am3d="http://schemas.microsoft.com/office/drawing/2017/model3d" xmlns:o="urn:schemas-microsoft-com:office:office" xmlns:oel="http://schemas.microsoft.com/office/2019/extlst" xmlns:r="http://schemas.openxmlformats.org/officeDocument/2006/relationships" xmlns:m="http://schemas.openxmlformats.org/officeDocument/2006/math" xmlns:v="urn:schemas-microsoft-com:vml" xmlns:wp14="http://schemas.microsoft.com/office/word/2010/wordprocessingDrawing" xmlns:wp="http://schemas.openxmlformats.org/drawingml/2006/wordprocessingDrawing" xmlns:w10="urn:schemas-microsoft-com:office:word" xmlns:w="http://schemas.openxmlformats.org/wordprocessingml/2006/main" xmlns:w14="http://schemas.microsoft.com/office/word/2010/wordml" xmlns:w15="http://schemas.microsoft.com/office/word/2012/wordml" xmlns:w16cex="http://schemas.microsoft.com/office/word/2018/wordml/cex" xmlns:w16cid="http://schemas.microsoft.com/office/word/2016/wordml/cid" xmlns:w16="http://schemas.microsoft.com/office/word/2018/wordml" xmlns:w16du="http://schemas.microsoft.com/office/word/2023/wordml/word16du" xmlns:w16sdtdh="http://schemas.microsoft.com/office/word/2020/wordml/sdtdatahash" xmlns:w16sdtfl="http://schemas.microsoft.com/office/word/2024/wordml/sdtformatlock" xmlns:w16se="http://schemas.microsoft.com/office/word/2015/wordml/symex" xmlns:wpg="http://schemas.microsoft.com/office/word/2010/wordprocessingGroup" xmlns:wpi="http://schemas.microsoft.com/office/word/2010/wordprocessingInk" xmlns:wne="http://schemas.microsoft.com/office/word/2006/wordml" xmlns:wps="http://schemas.microsoft.com/office/word/2010/wordprocessingShape" mc:Ignorable="w14 w15 w16se w16cid w16 w16cex w16sdtdh w16sdtfl w16du wp14">
+<w:numbering xmlns:wpc="http://schemas.microsoft.com/office/word/2010/wordprocessingCanvas" xmlns:cx="http://schemas.microsoft.com/office/drawing/2014/chartex" xmlns:cx1="http://schemas.microsoft.com/office/drawing/2015/9/8/chartex" xmlns:cx2="http://schemas.microsoft.com/office/drawing/2015/10/21/chartex" xmlns:cx3="http://schemas.microsoft.com/office/drawing/2016/5/9/chartex" xmlns:cx4="http://schemas.microsoft.com/office/drawing/2016/5/10/chartex" xmlns:cx5="http://schemas.microsoft.com/office/drawing/2016/5/11/chartex" xmlns:cx6="http://schemas.microsoft.com/office/drawing/2016/5/12/chartex" xmlns:cx7="http://schemas.microsoft.com/office/drawing/2016/5/13/chartex" xmlns:cx8="http://schemas.microsoft.com/office/drawing/2016/5/14/chartex" xmlns:mc="http://schemas.openxmlformats.org/markup-compatibility/2006" xmlns:aink="http://schemas.microsoft.com/office/drawing/2016/ink" xmlns:am3d="http://schemas.microsoft.com/office/drawing/2017/model3d" xmlns:o="urn:schemas-microsoft-com:office:office" xmlns:r="http://schemas.openxmlformats.org/officeDocument/2006/relationships" xmlns:m="http://schemas.openxmlformats.org/officeDocument/2006/math" xmlns:v="urn:schemas-microsoft-com:vml" xmlns:wp14="http://schemas.microsoft.com/office/word/2010/wordprocessingDrawing" xmlns:wp="http://schemas.openxmlformats.org/drawingml/2006/wordprocessingDrawing" xmlns:w10="urn:schemas-microsoft-com:office:word" xmlns:w="http://schemas.openxmlformats.org/wordprocessingml/2006/main" xmlns:w14="http://schemas.microsoft.com/office/word/2010/wordml" xmlns:w15="http://schemas.microsoft.com/office/word/2012/wordml" xmlns:w16cex="http://schemas.microsoft.com/office/word/2018/wordml/cex" xmlns:w16cid="http://schemas.microsoft.com/office/word/2016/wordml/cid" xmlns:w16="http://schemas.microsoft.com/office/word/2018/wordml" xmlns:w16sdtdh="http://schemas.microsoft.com/office/word/2020/wordml/sdtdatahash" xmlns:w16se="http://schemas.microsoft.com/office/word/2015/wordml/symex" xmlns:wpg="http://schemas.microsoft.com/office/word/2010/wordprocessingGroup" xmlns:wpi="http://schemas.microsoft.com/office/word/2010/wordprocessingInk" xmlns:wne="http://schemas.microsoft.com/office/word/2006/wordml" xmlns:wps="http://schemas.microsoft.com/office/word/2010/wordprocessingShape" mc:Ignorable="w14 w15 w16se w16cid w16 w16cex w16sdtdh wp14">
   <w:abstractNum w:abstractNumId="0" w15:restartNumberingAfterBreak="0">
     <w:nsid w:val="0FAD1A09"/>
     <w:multiLevelType w:val="multilevel"/>
@@ -12295,8 +12228,8 @@
   <w:abstractNum w:abstractNumId="6" w15:restartNumberingAfterBreak="0">
     <w:nsid w:val="51130D70"/>
     <w:multiLevelType w:val="hybridMultilevel"/>
-    <w:tmpl w:val="95F2F730"/>
-    <w:lvl w:ilvl="0" w:tplc="0419000F">
+    <w:tmpl w:val="58008D1C"/>
+    <w:lvl w:ilvl="0" w:tplc="E5024470">
       <w:start w:val="1"/>
       <w:numFmt w:val="decimal"/>
       <w:lvlText w:val="%1."/>
@@ -12306,6 +12239,8 @@
       </w:pPr>
       <w:rPr>
         <w:rFonts w:hint="default"/>
+        <w:sz w:val="24"/>
+        <w:szCs w:val="24"/>
       </w:rPr>
     </w:lvl>
     <w:lvl w:ilvl="1" w:tplc="04190019" w:tentative="1">
@@ -12467,35 +12402,35 @@
       </w:pPr>
     </w:lvl>
   </w:abstractNum>
-  <w:num w:numId="1" w16cid:durableId="399517942">
+  <w:num w:numId="1">
     <w:abstractNumId w:val="3"/>
   </w:num>
-  <w:num w:numId="2" w16cid:durableId="443500468">
+  <w:num w:numId="2">
     <w:abstractNumId w:val="1"/>
   </w:num>
-  <w:num w:numId="3" w16cid:durableId="489054233">
+  <w:num w:numId="3">
     <w:abstractNumId w:val="7"/>
   </w:num>
-  <w:num w:numId="4" w16cid:durableId="1134054903">
+  <w:num w:numId="4">
     <w:abstractNumId w:val="0"/>
   </w:num>
-  <w:num w:numId="5" w16cid:durableId="663818197">
+  <w:num w:numId="5">
     <w:abstractNumId w:val="2"/>
   </w:num>
-  <w:num w:numId="6" w16cid:durableId="688333881">
+  <w:num w:numId="6">
     <w:abstractNumId w:val="4"/>
   </w:num>
-  <w:num w:numId="7" w16cid:durableId="754859867">
+  <w:num w:numId="7">
     <w:abstractNumId w:val="5"/>
   </w:num>
-  <w:num w:numId="8" w16cid:durableId="2036686952">
+  <w:num w:numId="8">
     <w:abstractNumId w:val="6"/>
   </w:num>
 </w:numbering>
 </file>
 
 <file path=word/styles.xml><?xml version="1.0" encoding="utf-8"?>
-<w:styles xmlns:mc="http://schemas.openxmlformats.org/markup-compatibility/2006" xmlns:r="http://schemas.openxmlformats.org/officeDocument/2006/relationships" xmlns:w="http://schemas.openxmlformats.org/wordprocessingml/2006/main" xmlns:w14="http://schemas.microsoft.com/office/word/2010/wordml" xmlns:w15="http://schemas.microsoft.com/office/word/2012/wordml" xmlns:w16cex="http://schemas.microsoft.com/office/word/2018/wordml/cex" xmlns:w16cid="http://schemas.microsoft.com/office/word/2016/wordml/cid" xmlns:w16="http://schemas.microsoft.com/office/word/2018/wordml" xmlns:w16du="http://schemas.microsoft.com/office/word/2023/wordml/word16du" xmlns:w16sdtdh="http://schemas.microsoft.com/office/word/2020/wordml/sdtdatahash" xmlns:w16sdtfl="http://schemas.microsoft.com/office/word/2024/wordml/sdtformatlock" xmlns:w16se="http://schemas.microsoft.com/office/word/2015/wordml/symex" mc:Ignorable="w14 w15 w16se w16cid w16 w16cex w16sdtdh w16sdtfl w16du">
+<w:styles xmlns:mc="http://schemas.openxmlformats.org/markup-compatibility/2006" xmlns:r="http://schemas.openxmlformats.org/officeDocument/2006/relationships" xmlns:w="http://schemas.openxmlformats.org/wordprocessingml/2006/main" xmlns:w14="http://schemas.microsoft.com/office/word/2010/wordml" xmlns:w15="http://schemas.microsoft.com/office/word/2012/wordml" xmlns:w16cex="http://schemas.microsoft.com/office/word/2018/wordml/cex" xmlns:w16cid="http://schemas.microsoft.com/office/word/2016/wordml/cid" xmlns:w16="http://schemas.microsoft.com/office/word/2018/wordml" xmlns:w16sdtdh="http://schemas.microsoft.com/office/word/2020/wordml/sdtdatahash" xmlns:w16se="http://schemas.microsoft.com/office/word/2015/wordml/symex" mc:Ignorable="w14 w15 w16se w16cid w16 w16cex w16sdtdh">
   <w:docDefaults>
     <w:rPrDefault>
       <w:rPr>

</xml_diff>